<commit_message>
Switch report and program to Visual Studio stack
Co-authored-by: nikita4lost <nikita4lost@users.noreply.github.com>
</commit_message>
<xml_diff>
--- a/otchet_mikhailov_nikita.docx
+++ b/otchet_mikhailov_nikita.docx
@@ -3659,7 +3659,7 @@
           <w:sz w:val="28"/>
           <w:szCs w:val="28"/>
         </w:rPr>
-        <w:t xml:space="preserve">Программное обеспечение: на ноутбуке установлены Visual Studio 2022, </w:t>
+        <w:t>Программное обеспечение: на ноутбуке установлены Visual Studio 2022, Android Studio с Android Emulator, .NET 8 SDK, Microsoft Office, браузеры, Git.</w:t>
       </w:r>
       <w:proofErr w:type="spellStart"/>
       <w:r>
@@ -3668,7 +3668,6 @@
           <w:sz w:val="28"/>
           <w:szCs w:val="28"/>
         </w:rPr>
-        <w:t>Android</w:t>
       </w:r>
       <w:proofErr w:type="spellEnd"/>
       <w:r>
@@ -3677,7 +3676,6 @@
           <w:sz w:val="28"/>
           <w:szCs w:val="28"/>
         </w:rPr>
-        <w:t xml:space="preserve"> Studio, Python 3.x, Microsoft Office, браузеры, </w:t>
       </w:r>
       <w:proofErr w:type="spellStart"/>
       <w:r>
@@ -3686,7 +3684,6 @@
           <w:sz w:val="28"/>
           <w:szCs w:val="28"/>
         </w:rPr>
-        <w:t>Git</w:t>
       </w:r>
       <w:proofErr w:type="spellEnd"/>
       <w:r>
@@ -3695,7 +3692,6 @@
           <w:sz w:val="28"/>
           <w:szCs w:val="28"/>
         </w:rPr>
-        <w:t>.</w:t>
       </w:r>
     </w:p>
     <w:p>
@@ -8761,47 +8757,43 @@
             </w:pPr>
             <w:r>
               <w:rPr>
-                <w:rFonts w:ascii="Times New Roman" w:eastAsia="Calibri" w:hAnsi="Times New Roman" w:cs="Times New Roman"/>
-                <w:sz w:val="28"/>
-                <w:szCs w:val="28"/>
-              </w:rPr>
-              <w:t xml:space="preserve">Выбор C# + WPF для ПК, Python + </w:t>
+                <w:rFonts w:ascii="Times New Roman" w:eastAsia="Times New Roman" w:hAnsi="Times New Roman" w:cs="Times New Roman"/>
+                <w:sz w:val="28"/>
+                <w:szCs w:val="28"/>
+              </w:rPr>
+              <w:t>Выбор C# + WPF для ПК, C# + .NET MAUI/.NET MAUI для мобильного приложения</w:t>
             </w:r>
             <w:proofErr w:type="spellStart"/>
             <w:r>
               <w:rPr>
-                <w:rFonts w:ascii="Times New Roman" w:eastAsia="Calibri" w:hAnsi="Times New Roman" w:cs="Times New Roman"/>
-                <w:sz w:val="28"/>
-                <w:szCs w:val="28"/>
-              </w:rPr>
-              <w:t>Kivy</w:t>
+                <w:rFonts w:ascii="Times New Roman" w:eastAsia="Times New Roman" w:hAnsi="Times New Roman" w:cs="Times New Roman"/>
+                <w:sz w:val="28"/>
+                <w:szCs w:val="28"/>
+              </w:rPr>
             </w:r>
             <w:proofErr w:type="spellEnd"/>
             <w:r>
               <w:rPr>
-                <w:rFonts w:ascii="Times New Roman" w:eastAsia="Calibri" w:hAnsi="Times New Roman" w:cs="Times New Roman"/>
-                <w:sz w:val="28"/>
-                <w:szCs w:val="28"/>
-              </w:rPr>
-              <w:t>/</w:t>
+                <w:rFonts w:ascii="Times New Roman" w:eastAsia="Times New Roman" w:hAnsi="Times New Roman" w:cs="Times New Roman"/>
+                <w:sz w:val="28"/>
+                <w:szCs w:val="28"/>
+              </w:rPr>
             </w:r>
             <w:proofErr w:type="spellStart"/>
             <w:r>
               <w:rPr>
-                <w:rFonts w:ascii="Times New Roman" w:eastAsia="Calibri" w:hAnsi="Times New Roman" w:cs="Times New Roman"/>
-                <w:sz w:val="28"/>
-                <w:szCs w:val="28"/>
-              </w:rPr>
-              <w:t>KivyMD</w:t>
+                <w:rFonts w:ascii="Times New Roman" w:eastAsia="Times New Roman" w:hAnsi="Times New Roman" w:cs="Times New Roman"/>
+                <w:sz w:val="28"/>
+                <w:szCs w:val="28"/>
+              </w:rPr>
             </w:r>
             <w:proofErr w:type="spellEnd"/>
             <w:r>
               <w:rPr>
-                <w:rFonts w:ascii="Times New Roman" w:eastAsia="Calibri" w:hAnsi="Times New Roman" w:cs="Times New Roman"/>
-                <w:sz w:val="28"/>
-                <w:szCs w:val="28"/>
-              </w:rPr>
-              <w:t xml:space="preserve"> для мобильного приложения</w:t>
+                <w:rFonts w:ascii="Times New Roman" w:eastAsia="Times New Roman" w:hAnsi="Times New Roman" w:cs="Times New Roman"/>
+                <w:sz w:val="28"/>
+                <w:szCs w:val="28"/>
+              </w:rPr>
             </w:r>
           </w:p>
         </w:tc>
@@ -9189,56 +9181,51 @@
             </w:pPr>
             <w:r>
               <w:rPr>
-                <w:rFonts w:ascii="Times New Roman" w:eastAsia="Calibri" w:hAnsi="Times New Roman" w:cs="Times New Roman"/>
-                <w:sz w:val="28"/>
-                <w:szCs w:val="28"/>
-              </w:rPr>
-              <w:t xml:space="preserve">Установка Visual Studio, </w:t>
+                <w:rFonts w:ascii="Times New Roman" w:eastAsia="Times New Roman" w:hAnsi="Times New Roman" w:cs="Times New Roman"/>
+                <w:sz w:val="28"/>
+                <w:szCs w:val="28"/>
+              </w:rPr>
+              <w:t>Установка Visual Studio, Visual Studio 2022, Git, настройка эмуляторов Android</w:t>
             </w:r>
             <w:proofErr w:type="spellStart"/>
             <w:r>
               <w:rPr>
-                <w:rFonts w:ascii="Times New Roman" w:eastAsia="Calibri" w:hAnsi="Times New Roman" w:cs="Times New Roman"/>
-                <w:sz w:val="28"/>
-                <w:szCs w:val="28"/>
-              </w:rPr>
-              <w:t>PyCharm</w:t>
+                <w:rFonts w:ascii="Times New Roman" w:eastAsia="Times New Roman" w:hAnsi="Times New Roman" w:cs="Times New Roman"/>
+                <w:sz w:val="28"/>
+                <w:szCs w:val="28"/>
+              </w:rPr>
             </w:r>
             <w:proofErr w:type="spellEnd"/>
             <w:r>
               <w:rPr>
-                <w:rFonts w:ascii="Times New Roman" w:eastAsia="Calibri" w:hAnsi="Times New Roman" w:cs="Times New Roman"/>
-                <w:sz w:val="28"/>
-                <w:szCs w:val="28"/>
-              </w:rPr>
-              <w:t xml:space="preserve">, </w:t>
+                <w:rFonts w:ascii="Times New Roman" w:eastAsia="Times New Roman" w:hAnsi="Times New Roman" w:cs="Times New Roman"/>
+                <w:sz w:val="28"/>
+                <w:szCs w:val="28"/>
+              </w:rPr>
             </w:r>
             <w:proofErr w:type="spellStart"/>
             <w:r>
               <w:rPr>
-                <w:rFonts w:ascii="Times New Roman" w:eastAsia="Calibri" w:hAnsi="Times New Roman" w:cs="Times New Roman"/>
-                <w:sz w:val="28"/>
-                <w:szCs w:val="28"/>
-              </w:rPr>
-              <w:t>Git</w:t>
+                <w:rFonts w:ascii="Times New Roman" w:eastAsia="Times New Roman" w:hAnsi="Times New Roman" w:cs="Times New Roman"/>
+                <w:sz w:val="28"/>
+                <w:szCs w:val="28"/>
+              </w:rPr>
             </w:r>
             <w:proofErr w:type="spellEnd"/>
             <w:r>
               <w:rPr>
-                <w:rFonts w:ascii="Times New Roman" w:eastAsia="Calibri" w:hAnsi="Times New Roman" w:cs="Times New Roman"/>
-                <w:sz w:val="28"/>
-                <w:szCs w:val="28"/>
-              </w:rPr>
-              <w:t xml:space="preserve">, настройка эмуляторов </w:t>
+                <w:rFonts w:ascii="Times New Roman" w:eastAsia="Times New Roman" w:hAnsi="Times New Roman" w:cs="Times New Roman"/>
+                <w:sz w:val="28"/>
+                <w:szCs w:val="28"/>
+              </w:rPr>
             </w:r>
             <w:proofErr w:type="spellStart"/>
             <w:r>
               <w:rPr>
-                <w:rFonts w:ascii="Times New Roman" w:eastAsia="Calibri" w:hAnsi="Times New Roman" w:cs="Times New Roman"/>
-                <w:sz w:val="28"/>
-                <w:szCs w:val="28"/>
-              </w:rPr>
-              <w:t>Android</w:t>
+                <w:rFonts w:ascii="Times New Roman" w:eastAsia="Times New Roman" w:hAnsi="Times New Roman" w:cs="Times New Roman"/>
+                <w:sz w:val="28"/>
+                <w:szCs w:val="28"/>
+              </w:rPr>
             </w:r>
             <w:proofErr w:type="spellEnd"/>
           </w:p>
@@ -11064,32 +11051,30 @@
           <w:sz w:val="28"/>
           <w:szCs w:val="28"/>
         </w:rPr>
-        <w:t xml:space="preserve">Недостаточная квалификация разработчика (вероятность: средняя) </w:t>
-      </w:r>
-      <w:r>
-        <w:rPr>
-          <w:rFonts w:ascii="Times New Roman" w:eastAsia="Times New Roman" w:hAnsi="Times New Roman" w:cs="Times New Roman"/>
-          <w:sz w:val="28"/>
-          <w:szCs w:val="28"/>
-        </w:rPr>
-        <w:t>-</w:t>
-      </w:r>
-      <w:r>
-        <w:rPr>
-          <w:rFonts w:ascii="Times New Roman" w:eastAsia="Times New Roman" w:hAnsi="Times New Roman" w:cs="Times New Roman"/>
-          <w:sz w:val="28"/>
-          <w:szCs w:val="28"/>
-        </w:rPr>
-        <w:t xml:space="preserve"> возможны задержки.</w:t>
-      </w:r>
-      <w:r>
-        <w:rPr>
-          <w:rFonts w:ascii="Times New Roman" w:eastAsia="Times New Roman" w:hAnsi="Times New Roman" w:cs="Times New Roman"/>
-          <w:sz w:val="28"/>
-          <w:szCs w:val="28"/>
-        </w:rPr>
+        <w:t>Недостаточная квалификация разработчика (вероятность: средняя) - возможны задержки.</w:t>
         <w:br/>
-        <w:t xml:space="preserve">Меры: изучение документации по WPF, </w:t>
+        <w:t>Меры: изучение документации по WPF, .NET MAUI и Firebase; консультации с руководителем практики.</w:t>
+      </w:r>
+      <w:r>
+        <w:rPr>
+          <w:rFonts w:ascii="Times New Roman" w:eastAsia="Times New Roman" w:hAnsi="Times New Roman" w:cs="Times New Roman"/>
+          <w:sz w:val="28"/>
+          <w:szCs w:val="28"/>
+        </w:rPr>
+      </w:r>
+      <w:r>
+        <w:rPr>
+          <w:rFonts w:ascii="Times New Roman" w:eastAsia="Times New Roman" w:hAnsi="Times New Roman" w:cs="Times New Roman"/>
+          <w:sz w:val="28"/>
+          <w:szCs w:val="28"/>
+        </w:rPr>
+      </w:r>
+      <w:r>
+        <w:rPr>
+          <w:rFonts w:ascii="Times New Roman" w:eastAsia="Times New Roman" w:hAnsi="Times New Roman" w:cs="Times New Roman"/>
+          <w:sz w:val="28"/>
+          <w:szCs w:val="28"/>
+        </w:rPr>
       </w:r>
       <w:proofErr w:type="spellStart"/>
       <w:r>
@@ -11098,7 +11083,6 @@
           <w:sz w:val="28"/>
           <w:szCs w:val="28"/>
         </w:rPr>
-        <w:t>Firebase</w:t>
       </w:r>
       <w:proofErr w:type="spellEnd"/>
       <w:r>
@@ -11107,7 +11091,6 @@
           <w:sz w:val="28"/>
           <w:szCs w:val="28"/>
         </w:rPr>
-        <w:t xml:space="preserve">, </w:t>
       </w:r>
       <w:proofErr w:type="spellStart"/>
       <w:r>
@@ -11116,7 +11099,6 @@
           <w:sz w:val="28"/>
           <w:szCs w:val="28"/>
         </w:rPr>
-        <w:t>KivyMD</w:t>
       </w:r>
       <w:proofErr w:type="spellEnd"/>
       <w:r>
@@ -11125,7 +11107,6 @@
           <w:sz w:val="28"/>
           <w:szCs w:val="28"/>
         </w:rPr>
-        <w:t>; консультации с руководителем практики.</w:t>
       </w:r>
     </w:p>
     <w:p>
@@ -13326,23 +13307,21 @@
           <w:sz w:val="28"/>
           <w:szCs w:val="28"/>
         </w:rPr>
-        <w:t xml:space="preserve">Язык программирования: Python </w:t>
-      </w:r>
-      <w:r>
-        <w:rPr>
-          <w:rFonts w:ascii="Times New Roman" w:eastAsia="Times New Roman" w:hAnsi="Times New Roman" w:cs="Times New Roman"/>
-          <w:sz w:val="28"/>
-          <w:szCs w:val="28"/>
-        </w:rPr>
-        <w:t>-</w:t>
-      </w:r>
-      <w:r>
-        <w:rPr>
-          <w:rFonts w:ascii="Times New Roman" w:eastAsia="Times New Roman" w:hAnsi="Times New Roman" w:cs="Times New Roman"/>
-          <w:sz w:val="28"/>
-          <w:szCs w:val="28"/>
-        </w:rPr>
-        <w:t xml:space="preserve"> быстрая разработка, кроссплатформенность, большое количество библиотек для работы с </w:t>
+        <w:t>Язык программирования: C# - единый язык для десктопной и мобильной версии, удобная работа в Visual Studio и возможность переиспользования моделей данных.</w:t>
+      </w:r>
+      <w:r>
+        <w:rPr>
+          <w:rFonts w:ascii="Times New Roman" w:eastAsia="Times New Roman" w:hAnsi="Times New Roman" w:cs="Times New Roman"/>
+          <w:sz w:val="28"/>
+          <w:szCs w:val="28"/>
+        </w:rPr>
+      </w:r>
+      <w:r>
+        <w:rPr>
+          <w:rFonts w:ascii="Times New Roman" w:eastAsia="Times New Roman" w:hAnsi="Times New Roman" w:cs="Times New Roman"/>
+          <w:sz w:val="28"/>
+          <w:szCs w:val="28"/>
+        </w:rPr>
       </w:r>
       <w:proofErr w:type="spellStart"/>
       <w:r>
@@ -13351,7 +13330,6 @@
           <w:sz w:val="28"/>
           <w:szCs w:val="28"/>
         </w:rPr>
-        <w:t>Firebase</w:t>
       </w:r>
       <w:proofErr w:type="spellEnd"/>
       <w:r>
@@ -13360,7 +13338,6 @@
           <w:sz w:val="28"/>
           <w:szCs w:val="28"/>
         </w:rPr>
-        <w:t xml:space="preserve"> и </w:t>
       </w:r>
       <w:proofErr w:type="spellStart"/>
       <w:r>
@@ -13369,7 +13346,6 @@
           <w:sz w:val="28"/>
           <w:szCs w:val="28"/>
         </w:rPr>
-        <w:t>SQLite</w:t>
       </w:r>
       <w:proofErr w:type="spellEnd"/>
       <w:r>
@@ -13378,7 +13354,6 @@
           <w:sz w:val="28"/>
           <w:szCs w:val="28"/>
         </w:rPr>
-        <w:t>.</w:t>
       </w:r>
     </w:p>
     <w:p>
@@ -13401,7 +13376,7 @@
           <w:sz w:val="28"/>
           <w:szCs w:val="28"/>
         </w:rPr>
-        <w:t>Графический фреймворк: </w:t>
+        <w:t>Графический фреймворк: .NET MAUI - кроссплатформенный фреймворк Microsoft для создания мобильного приложения Android из Visual Studio.</w:t>
       </w:r>
       <w:proofErr w:type="spellStart"/>
       <w:r>
@@ -13410,7 +13385,6 @@
           <w:sz w:val="28"/>
           <w:szCs w:val="28"/>
         </w:rPr>
-        <w:t>Kivy</w:t>
       </w:r>
       <w:proofErr w:type="spellEnd"/>
       <w:r>
@@ -13419,7 +13393,6 @@
           <w:sz w:val="28"/>
           <w:szCs w:val="28"/>
         </w:rPr>
-        <w:t xml:space="preserve"> + </w:t>
       </w:r>
       <w:proofErr w:type="spellStart"/>
       <w:r>
@@ -13428,7 +13401,6 @@
           <w:sz w:val="28"/>
           <w:szCs w:val="28"/>
         </w:rPr>
-        <w:t>KivyMD</w:t>
       </w:r>
       <w:proofErr w:type="spellEnd"/>
       <w:r>
@@ -13437,23 +13409,20 @@
           <w:sz w:val="28"/>
           <w:szCs w:val="28"/>
         </w:rPr>
-        <w:t xml:space="preserve"> </w:t>
-      </w:r>
-      <w:r>
-        <w:rPr>
-          <w:rFonts w:ascii="Times New Roman" w:eastAsia="Times New Roman" w:hAnsi="Times New Roman" w:cs="Times New Roman"/>
-          <w:sz w:val="28"/>
-          <w:szCs w:val="28"/>
-        </w:rPr>
-        <w:t>-</w:t>
-      </w:r>
-      <w:r>
-        <w:rPr>
-          <w:rFonts w:ascii="Times New Roman" w:eastAsia="Times New Roman" w:hAnsi="Times New Roman" w:cs="Times New Roman"/>
-          <w:sz w:val="28"/>
-          <w:szCs w:val="28"/>
-        </w:rPr>
-        <w:t xml:space="preserve"> </w:t>
+      </w:r>
+      <w:r>
+        <w:rPr>
+          <w:rFonts w:ascii="Times New Roman" w:eastAsia="Times New Roman" w:hAnsi="Times New Roman" w:cs="Times New Roman"/>
+          <w:sz w:val="28"/>
+          <w:szCs w:val="28"/>
+        </w:rPr>
+      </w:r>
+      <w:r>
+        <w:rPr>
+          <w:rFonts w:ascii="Times New Roman" w:eastAsia="Times New Roman" w:hAnsi="Times New Roman" w:cs="Times New Roman"/>
+          <w:sz w:val="28"/>
+          <w:szCs w:val="28"/>
+        </w:rPr>
       </w:r>
       <w:proofErr w:type="spellStart"/>
       <w:r>
@@ -13462,7 +13431,6 @@
           <w:sz w:val="28"/>
           <w:szCs w:val="28"/>
         </w:rPr>
-        <w:t>Material</w:t>
       </w:r>
       <w:proofErr w:type="spellEnd"/>
       <w:r>
@@ -13471,7 +13439,6 @@
           <w:sz w:val="28"/>
           <w:szCs w:val="28"/>
         </w:rPr>
-        <w:t xml:space="preserve"> Design компоненты, нативная поддержка </w:t>
       </w:r>
       <w:proofErr w:type="spellStart"/>
       <w:r>
@@ -13480,7 +13447,6 @@
           <w:sz w:val="28"/>
           <w:szCs w:val="28"/>
         </w:rPr>
-        <w:t>Android</w:t>
       </w:r>
       <w:proofErr w:type="spellEnd"/>
       <w:r>
@@ -13489,7 +13455,6 @@
           <w:sz w:val="28"/>
           <w:szCs w:val="28"/>
         </w:rPr>
-        <w:t>, возможность работы в офлайн-режиме.</w:t>
       </w:r>
     </w:p>
     <w:p>
@@ -13512,7 +13477,7 @@
           <w:sz w:val="28"/>
           <w:szCs w:val="28"/>
         </w:rPr>
-        <w:t>Среда разработки: </w:t>
+        <w:t>Среда разработки: Visual Studio 2022 с workload .NET Multi-platform App UI development.</w:t>
       </w:r>
       <w:proofErr w:type="spellStart"/>
       <w:r>
@@ -13521,7 +13486,6 @@
           <w:sz w:val="28"/>
           <w:szCs w:val="28"/>
         </w:rPr>
-        <w:t>PyCharm</w:t>
       </w:r>
       <w:proofErr w:type="spellEnd"/>
       <w:r>
@@ -13530,7 +13494,6 @@
           <w:sz w:val="28"/>
           <w:szCs w:val="28"/>
         </w:rPr>
-        <w:t xml:space="preserve"> (или VS Code).</w:t>
       </w:r>
     </w:p>
     <w:p>
@@ -14497,11 +14460,11 @@
             </w:pPr>
             <w:r>
               <w:rPr>
-                <w:rFonts w:ascii="Times New Roman" w:eastAsia="Calibri" w:hAnsi="Times New Roman" w:cs="Times New Roman"/>
-                <w:sz w:val="28"/>
-                <w:szCs w:val="28"/>
-              </w:rPr>
-              <w:t>Мобильное (Python)</w:t>
+                <w:rFonts w:ascii="Times New Roman" w:eastAsia="Times New Roman" w:hAnsi="Times New Roman" w:cs="Times New Roman"/>
+                <w:sz w:val="28"/>
+                <w:szCs w:val="28"/>
+              </w:rPr>
+              <w:t>Мобильное (.NET MAUI)</w:t>
             </w:r>
           </w:p>
         </w:tc>
@@ -14579,11 +14542,11 @@
             </w:pPr>
             <w:r>
               <w:rPr>
-                <w:rFonts w:ascii="Times New Roman" w:eastAsia="Calibri" w:hAnsi="Times New Roman" w:cs="Times New Roman"/>
-                <w:sz w:val="28"/>
-                <w:szCs w:val="28"/>
-              </w:rPr>
-              <w:t>Мобильное (Python)</w:t>
+                <w:rFonts w:ascii="Times New Roman" w:eastAsia="Times New Roman" w:hAnsi="Times New Roman" w:cs="Times New Roman"/>
+                <w:sz w:val="28"/>
+                <w:szCs w:val="28"/>
+              </w:rPr>
+              <w:t>Мобильное (.NET MAUI)</w:t>
             </w:r>
           </w:p>
         </w:tc>
@@ -14679,11 +14642,11 @@
             </w:pPr>
             <w:r>
               <w:rPr>
-                <w:rFonts w:ascii="Times New Roman" w:eastAsia="Calibri" w:hAnsi="Times New Roman" w:cs="Times New Roman"/>
-                <w:sz w:val="28"/>
-                <w:szCs w:val="28"/>
-              </w:rPr>
-              <w:t>Мобильное (Python)</w:t>
+                <w:rFonts w:ascii="Times New Roman" w:eastAsia="Times New Roman" w:hAnsi="Times New Roman" w:cs="Times New Roman"/>
+                <w:sz w:val="28"/>
+                <w:szCs w:val="28"/>
+              </w:rPr>
+              <w:t>Мобильное (.NET MAUI)</w:t>
             </w:r>
           </w:p>
         </w:tc>
@@ -14797,11 +14760,11 @@
             </w:pPr>
             <w:r>
               <w:rPr>
-                <w:rFonts w:ascii="Times New Roman" w:eastAsia="Calibri" w:hAnsi="Times New Roman" w:cs="Times New Roman"/>
-                <w:sz w:val="28"/>
-                <w:szCs w:val="28"/>
-              </w:rPr>
-              <w:t>Мобильное (Python)</w:t>
+                <w:rFonts w:ascii="Times New Roman" w:eastAsia="Times New Roman" w:hAnsi="Times New Roman" w:cs="Times New Roman"/>
+                <w:sz w:val="28"/>
+                <w:szCs w:val="28"/>
+              </w:rPr>
+              <w:t>Мобильное (.NET MAUI)</w:t>
             </w:r>
           </w:p>
         </w:tc>
@@ -15980,7 +15943,7 @@
           <w:sz w:val="28"/>
           <w:szCs w:val="28"/>
         </w:rPr>
-        <w:t xml:space="preserve">Python + </w:t>
+        <w:t>C# + .NET MAUI для мобильного приложения инженера (офлайн-доступ, изменение статусов, технические заключения);</w:t>
       </w:r>
       <w:proofErr w:type="spellStart"/>
       <w:r>
@@ -15989,7 +15952,6 @@
           <w:sz w:val="28"/>
           <w:szCs w:val="28"/>
         </w:rPr>
-        <w:t>Kivy</w:t>
       </w:r>
       <w:proofErr w:type="spellEnd"/>
       <w:r>
@@ -15998,7 +15960,6 @@
           <w:sz w:val="28"/>
           <w:szCs w:val="28"/>
         </w:rPr>
-        <w:t>/</w:t>
       </w:r>
       <w:proofErr w:type="spellStart"/>
       <w:r>
@@ -16007,7 +15968,6 @@
           <w:sz w:val="28"/>
           <w:szCs w:val="28"/>
         </w:rPr>
-        <w:t>KivyMD</w:t>
       </w:r>
       <w:proofErr w:type="spellEnd"/>
       <w:r>
@@ -16016,7 +15976,6 @@
           <w:sz w:val="28"/>
           <w:szCs w:val="28"/>
         </w:rPr>
-        <w:t> для мобильного приложения инженера (офлайн-доступ, изменение статусов, технические заключения);</w:t>
       </w:r>
     </w:p>
     <w:p>
@@ -19897,7 +19856,7 @@
           <w:szCs w:val="28"/>
           <w:lang w:eastAsia="ru-RU"/>
         </w:rPr>
-        <w:t xml:space="preserve">4.2.2 Мобильное приложение (Python + </w:t>
+        <w:t>4.2.2 Мобильное приложение (C# + .NET MAUI)</w:t>
       </w:r>
       <w:proofErr w:type="spellStart"/>
       <w:r>
@@ -19907,7 +19866,6 @@
           <w:szCs w:val="28"/>
           <w:lang w:eastAsia="ru-RU"/>
         </w:rPr>
-        <w:t>Kivy</w:t>
       </w:r>
       <w:proofErr w:type="spellEnd"/>
       <w:r>
@@ -19917,7 +19875,6 @@
           <w:szCs w:val="28"/>
           <w:lang w:eastAsia="ru-RU"/>
         </w:rPr>
-        <w:t>/</w:t>
       </w:r>
       <w:proofErr w:type="spellStart"/>
       <w:r>
@@ -19927,7 +19884,6 @@
           <w:szCs w:val="28"/>
           <w:lang w:eastAsia="ru-RU"/>
         </w:rPr>
-        <w:t>KivyMD</w:t>
       </w:r>
       <w:proofErr w:type="spellEnd"/>
       <w:r>
@@ -19937,7 +19893,6 @@
           <w:szCs w:val="28"/>
           <w:lang w:eastAsia="ru-RU"/>
         </w:rPr>
-        <w:t>)</w:t>
       </w:r>
     </w:p>
     <w:p>
@@ -20486,7 +20441,7 @@
           <w:szCs w:val="28"/>
           <w:lang w:eastAsia="ru-RU"/>
         </w:rPr>
-        <w:t xml:space="preserve">Использование лицензионного ПО (.NET, Python, </w:t>
+        <w:t>Использование лицензионного ПО (.NET, Visual Studio, SQLite, Firebase).</w:t>
       </w:r>
       <w:proofErr w:type="spellStart"/>
       <w:r>
@@ -20496,7 +20451,6 @@
           <w:szCs w:val="28"/>
           <w:lang w:eastAsia="ru-RU"/>
         </w:rPr>
-        <w:t>SQLite</w:t>
       </w:r>
       <w:proofErr w:type="spellEnd"/>
       <w:r>
@@ -20506,7 +20460,6 @@
           <w:szCs w:val="28"/>
           <w:lang w:eastAsia="ru-RU"/>
         </w:rPr>
-        <w:t xml:space="preserve">, </w:t>
       </w:r>
       <w:proofErr w:type="spellStart"/>
       <w:r>
@@ -20516,7 +20469,6 @@
           <w:szCs w:val="28"/>
           <w:lang w:eastAsia="ru-RU"/>
         </w:rPr>
-        <w:t>Firebase</w:t>
       </w:r>
       <w:proofErr w:type="spellEnd"/>
       <w:r>
@@ -20526,7 +20478,6 @@
           <w:szCs w:val="28"/>
           <w:lang w:eastAsia="ru-RU"/>
         </w:rPr>
-        <w:t>).</w:t>
       </w:r>
     </w:p>
     <w:p>
@@ -21513,7 +21464,7 @@
                 <w:szCs w:val="28"/>
                 <w:lang w:eastAsia="ru-RU"/>
               </w:rPr>
-              <w:t xml:space="preserve">Разработка, отладка и тестирование (Python + </w:t>
+              <w:t>Разработка, отладка и тестирование (C# + .NET MAUI) - авторизация, изменение статуса, техзаключения</w:t>
             </w:r>
             <w:proofErr w:type="spellStart"/>
             <w:r>
@@ -21523,7 +21474,6 @@
                 <w:szCs w:val="28"/>
                 <w:lang w:eastAsia="ru-RU"/>
               </w:rPr>
-              <w:t>Kivy</w:t>
             </w:r>
             <w:proofErr w:type="spellEnd"/>
             <w:r>
@@ -21533,7 +21483,6 @@
                 <w:szCs w:val="28"/>
                 <w:lang w:eastAsia="ru-RU"/>
               </w:rPr>
-              <w:t xml:space="preserve">) </w:t>
             </w:r>
             <w:r>
               <w:rPr>
@@ -21542,7 +21491,6 @@
                 <w:szCs w:val="28"/>
                 <w:lang w:eastAsia="ru-RU"/>
               </w:rPr>
-              <w:t>-</w:t>
             </w:r>
             <w:r>
               <w:rPr>
@@ -21551,7 +21499,6 @@
                 <w:szCs w:val="28"/>
                 <w:lang w:eastAsia="ru-RU"/>
               </w:rPr>
-              <w:t xml:space="preserve"> авторизация, изменение статуса, </w:t>
             </w:r>
             <w:proofErr w:type="spellStart"/>
             <w:r>
@@ -21561,7 +21508,6 @@
                 <w:szCs w:val="28"/>
                 <w:lang w:eastAsia="ru-RU"/>
               </w:rPr>
-              <w:t>техзаключения</w:t>
             </w:r>
             <w:proofErr w:type="spellEnd"/>
           </w:p>
@@ -25269,14 +25215,19 @@
             <w:pPr>
               <w:spacing w:after="0" w:line="240" w:lineRule="auto"/>
             </w:pPr>
-            <w:r/>
-            <w:r>
-              <w:rPr>
-                <w:rFonts w:ascii="Times New Roman" w:hAnsi="Times New Roman" w:eastAsia="Times New Roman"/>
-                <w:b w:val="0"/>
-                <w:sz w:val="24"/>
-              </w:rPr>
-              <w:t>main.py</w:t>
+            <w:r>
+              <w:rPr>
+                <w:rFonts w:ascii="Times New Roman" w:hAnsi="Times New Roman" w:eastAsia="Times New Roman"/>
+                <w:sz w:val="28"/>
+              </w:rPr>
+              <w:t>MainPage.xaml.cs</w:t>
+            </w:r>
+            <w:r>
+              <w:rPr>
+                <w:rFonts w:ascii="Times New Roman" w:hAnsi="Times New Roman" w:eastAsia="Times New Roman"/>
+                <w:b w:val="0"/>
+                <w:sz w:val="24"/>
+              </w:rPr>
             </w:r>
           </w:p>
         </w:tc>
@@ -25289,14 +25240,19 @@
             <w:pPr>
               <w:spacing w:after="0" w:line="240" w:lineRule="auto"/>
             </w:pPr>
-            <w:r/>
-            <w:r>
-              <w:rPr>
-                <w:rFonts w:ascii="Times New Roman" w:hAnsi="Times New Roman" w:eastAsia="Times New Roman"/>
-                <w:b w:val="0"/>
-                <w:sz w:val="24"/>
-              </w:rPr>
-              <w:t>Основной файл Kivy-приложения</w:t>
+            <w:r>
+              <w:rPr>
+                <w:rFonts w:ascii="Times New Roman" w:hAnsi="Times New Roman" w:eastAsia="Times New Roman"/>
+                <w:sz w:val="28"/>
+              </w:rPr>
+              <w:t>Основной файл .NET MAUI-приложения</w:t>
+            </w:r>
+            <w:r>
+              <w:rPr>
+                <w:rFonts w:ascii="Times New Roman" w:hAnsi="Times New Roman" w:eastAsia="Times New Roman"/>
+                <w:b w:val="0"/>
+                <w:sz w:val="24"/>
+              </w:rPr>
             </w:r>
           </w:p>
         </w:tc>
@@ -25311,14 +25267,19 @@
             <w:pPr>
               <w:spacing w:after="0" w:line="240" w:lineRule="auto"/>
             </w:pPr>
-            <w:r/>
-            <w:r>
-              <w:rPr>
-                <w:rFonts w:ascii="Times New Roman" w:hAnsi="Times New Roman" w:eastAsia="Times New Roman"/>
-                <w:b w:val="0"/>
-                <w:sz w:val="24"/>
-              </w:rPr>
-              <w:t>requirements.txt</w:t>
+            <w:r>
+              <w:rPr>
+                <w:rFonts w:ascii="Times New Roman" w:hAnsi="Times New Roman" w:eastAsia="Times New Roman"/>
+                <w:sz w:val="28"/>
+              </w:rPr>
+              <w:t>WarrantyReturns.Mobile.csproj</w:t>
+            </w:r>
+            <w:r>
+              <w:rPr>
+                <w:rFonts w:ascii="Times New Roman" w:hAnsi="Times New Roman" w:eastAsia="Times New Roman"/>
+                <w:b w:val="0"/>
+                <w:sz w:val="24"/>
+              </w:rPr>
             </w:r>
           </w:p>
         </w:tc>
@@ -25331,14 +25292,19 @@
             <w:pPr>
               <w:spacing w:after="0" w:line="240" w:lineRule="auto"/>
             </w:pPr>
-            <w:r/>
-            <w:r>
-              <w:rPr>
-                <w:rFonts w:ascii="Times New Roman" w:hAnsi="Times New Roman" w:eastAsia="Times New Roman"/>
-                <w:b w:val="0"/>
-                <w:sz w:val="24"/>
-              </w:rPr>
-              <w:t>Список зависимостей Python</w:t>
+            <w:r>
+              <w:rPr>
+                <w:rFonts w:ascii="Times New Roman" w:hAnsi="Times New Roman" w:eastAsia="Times New Roman"/>
+                <w:sz w:val="24"/>
+              </w:rPr>
+              <w:t>Файл проекта MAUI и зависимости .NET</w:t>
+            </w:r>
+            <w:r>
+              <w:rPr>
+                <w:rFonts w:ascii="Times New Roman" w:hAnsi="Times New Roman" w:eastAsia="Times New Roman"/>
+                <w:b w:val="0"/>
+                <w:sz w:val="24"/>
+              </w:rPr>
             </w:r>
           </w:p>
         </w:tc>
@@ -25781,14 +25747,19 @@
             <w:pPr>
               <w:spacing w:after="0" w:line="240" w:lineRule="auto"/>
             </w:pPr>
-            <w:r/>
-            <w:r>
-              <w:rPr>
-                <w:rFonts w:ascii="Times New Roman" w:hAnsi="Times New Roman" w:eastAsia="Times New Roman"/>
-                <w:b w:val="0"/>
-                <w:sz w:val="24"/>
-              </w:rPr>
-              <w:t>Python 3.x</w:t>
+            <w:r>
+              <w:rPr>
+                <w:rFonts w:ascii="Times New Roman" w:hAnsi="Times New Roman" w:eastAsia="Times New Roman"/>
+                <w:sz w:val="24"/>
+              </w:rPr>
+              <w:t>.NET 8 SDK</w:t>
+            </w:r>
+            <w:r>
+              <w:rPr>
+                <w:rFonts w:ascii="Times New Roman" w:hAnsi="Times New Roman" w:eastAsia="Times New Roman"/>
+                <w:b w:val="0"/>
+                <w:sz w:val="24"/>
+              </w:rPr>
             </w:r>
           </w:p>
         </w:tc>
@@ -25823,14 +25794,19 @@
             <w:pPr>
               <w:spacing w:after="0" w:line="240" w:lineRule="auto"/>
             </w:pPr>
-            <w:r/>
-            <w:r>
-              <w:rPr>
-                <w:rFonts w:ascii="Times New Roman" w:hAnsi="Times New Roman" w:eastAsia="Times New Roman"/>
-                <w:b w:val="0"/>
-                <w:sz w:val="24"/>
-              </w:rPr>
-              <w:t>Kivy</w:t>
+            <w:r>
+              <w:rPr>
+                <w:rFonts w:ascii="Times New Roman" w:hAnsi="Times New Roman" w:eastAsia="Times New Roman"/>
+                <w:sz w:val="28"/>
+              </w:rPr>
+              <w:t>.NET MAUI</w:t>
+            </w:r>
+            <w:r>
+              <w:rPr>
+                <w:rFonts w:ascii="Times New Roman" w:hAnsi="Times New Roman" w:eastAsia="Times New Roman"/>
+                <w:b w:val="0"/>
+                <w:sz w:val="24"/>
+              </w:rPr>
             </w:r>
           </w:p>
         </w:tc>
@@ -26037,7 +26013,7 @@
           <w:b w:val="0"/>
           <w:sz w:val="28"/>
         </w:rPr>
-        <w:t>Таблица 17 Список установленных пакетов NuGet и Python</w:t>
+        <w:t>Таблица 17 Список установленных пакетов и компонентов .NET</w:t>
       </w:r>
     </w:p>
     <w:tbl>
@@ -26383,14 +26359,19 @@
             <w:pPr>
               <w:spacing w:after="0" w:line="240" w:lineRule="auto"/>
             </w:pPr>
-            <w:r/>
-            <w:r>
-              <w:rPr>
-                <w:rFonts w:ascii="Times New Roman" w:hAnsi="Times New Roman" w:eastAsia="Times New Roman"/>
-                <w:b w:val="0"/>
-                <w:sz w:val="24"/>
-              </w:rPr>
-              <w:t>Python</w:t>
+            <w:r>
+              <w:rPr>
+                <w:rFonts w:ascii="Times New Roman" w:hAnsi="Times New Roman" w:eastAsia="Times New Roman"/>
+                <w:sz w:val="24"/>
+              </w:rPr>
+              <w:t>C# / .NET MAUI</w:t>
+            </w:r>
+            <w:r>
+              <w:rPr>
+                <w:rFonts w:ascii="Times New Roman" w:hAnsi="Times New Roman" w:eastAsia="Times New Roman"/>
+                <w:b w:val="0"/>
+                <w:sz w:val="24"/>
+              </w:rPr>
             </w:r>
           </w:p>
         </w:tc>
@@ -26445,14 +26426,19 @@
             <w:pPr>
               <w:spacing w:after="0" w:line="240" w:lineRule="auto"/>
             </w:pPr>
-            <w:r/>
-            <w:r>
-              <w:rPr>
-                <w:rFonts w:ascii="Times New Roman" w:hAnsi="Times New Roman" w:eastAsia="Times New Roman"/>
-                <w:b w:val="0"/>
-                <w:sz w:val="24"/>
-              </w:rPr>
-              <w:t>Python</w:t>
+            <w:r>
+              <w:rPr>
+                <w:rFonts w:ascii="Times New Roman" w:hAnsi="Times New Roman" w:eastAsia="Times New Roman"/>
+                <w:sz w:val="24"/>
+              </w:rPr>
+              <w:t>C# / .NET MAUI</w:t>
+            </w:r>
+            <w:r>
+              <w:rPr>
+                <w:rFonts w:ascii="Times New Roman" w:hAnsi="Times New Roman" w:eastAsia="Times New Roman"/>
+                <w:b w:val="0"/>
+                <w:sz w:val="24"/>
+              </w:rPr>
             </w:r>
           </w:p>
         </w:tc>
@@ -29488,43 +29474,49 @@
       </w:pPr>
       <w:r>
         <w:rPr>
-          <w:rFonts w:ascii="Courier New" w:hAnsi="Courier New" w:eastAsia="Courier New"/>
+          <w:rFonts w:ascii="Times New Roman" w:hAnsi="Times New Roman" w:eastAsia="Times New Roman"/>
           <w:sz w:val="18"/>
         </w:rPr>
-        <w:t>def save_case(*_):</w:t>
+        <w:t>private async Task OpenCaseAsync(WarrantyCase item)</w:t>
         <w:br/>
-      </w:r>
-      <w:r>
-        <w:rPr>
-          <w:rFonts w:ascii="Courier New" w:hAnsi="Courier New" w:eastAsia="Courier New"/>
+        <w:t>{</w:t>
+        <w:br/>
+        <w:t xml:space="preserve">    var status = await DisplayActionSheet($"{item.Id} - {item.ProductName}", "Отмена", null, WarrantyCase.Statuses);</w:t>
+        <w:br/>
+        <w:t xml:space="preserve">    item.Status = status;</w:t>
+        <w:br/>
+        <w:t xml:space="preserve">    item.TechnicalConclusion = conclusion.Trim();</w:t>
+        <w:br/>
+        <w:t xml:space="preserve">    await _store.SaveAsync(_cases);</w:t>
+        <w:br/>
+        <w:t xml:space="preserve">    RefreshList();</w:t>
+        <w:br/>
+        <w:t>}</w:t>
+        <w:br/>
+      </w:r>
+      <w:r>
+        <w:rPr>
+          <w:rFonts w:ascii="Times New Roman" w:hAnsi="Times New Roman" w:eastAsia="Times New Roman"/>
           <w:sz w:val="18"/>
         </w:rPr>
-        <w:t xml:space="preserve">    item.Status = status_spinner.text</w:t>
-        <w:br/>
-      </w:r>
-      <w:r>
-        <w:rPr>
-          <w:rFonts w:ascii="Courier New" w:hAnsi="Courier New" w:eastAsia="Courier New"/>
+      </w:r>
+      <w:r>
+        <w:rPr>
+          <w:rFonts w:ascii="Times New Roman" w:hAnsi="Times New Roman" w:eastAsia="Times New Roman"/>
           <w:sz w:val="18"/>
         </w:rPr>
-        <w:t xml:space="preserve">    item.TechnicalConclusion = conclusion_input.text.strip()</w:t>
-        <w:br/>
-      </w:r>
-      <w:r>
-        <w:rPr>
-          <w:rFonts w:ascii="Courier New" w:hAnsi="Courier New" w:eastAsia="Courier New"/>
+      </w:r>
+      <w:r>
+        <w:rPr>
+          <w:rFonts w:ascii="Times New Roman" w:hAnsi="Times New Roman" w:eastAsia="Times New Roman"/>
           <w:sz w:val="18"/>
         </w:rPr>
-        <w:t xml:space="preserve">    self.store.save(self.cases)</w:t>
-        <w:br/>
-      </w:r>
-      <w:r>
-        <w:rPr>
-          <w:rFonts w:ascii="Courier New" w:hAnsi="Courier New" w:eastAsia="Courier New"/>
+      </w:r>
+      <w:r>
+        <w:rPr>
+          <w:rFonts w:ascii="Times New Roman" w:hAnsi="Times New Roman" w:eastAsia="Times New Roman"/>
           <w:sz w:val="18"/>
         </w:rPr>
-        <w:t xml:space="preserve">    self.refresh()</w:t>
-        <w:br/>
       </w:r>
     </w:p>
     <w:p>
@@ -30549,7 +30541,7 @@
           <w:b/>
           <w:sz w:val="28"/>
         </w:rPr>
-        <w:t>4.3.2 Основная логика мобильного приложения (Python + Kivy)</w:t>
+        <w:t>4.3.2 Основная логика мобильного приложения (C# + .NET MAUI)</w:t>
       </w:r>
     </w:p>
     <w:p>
@@ -30564,7 +30556,7 @@
           <w:b w:val="0"/>
           <w:sz w:val="28"/>
         </w:rPr>
-        <w:t>Мобильное приложение реализовано на Python с использованием Kivy. Оно читает общий файл заявок, отображает карточки, позволяет инженеру изменить статус и записать техническое заключение.</w:t>
+        <w:t>Мобильное приложение реализовано на C# с использованием .NET MAUI. Оно отображает карточки заявок, позволяет инженеру изменить статус, записать техническое заключение и сохранить данные в локальном JSON-хранилище приложения.</w:t>
       </w:r>
     </w:p>
     <w:p>
@@ -30631,75 +30623,75 @@
       </w:pPr>
       <w:r>
         <w:rPr>
-          <w:rFonts w:ascii="Courier New" w:hAnsi="Courier New" w:eastAsia="Courier New"/>
+          <w:rFonts w:ascii="Times New Roman" w:hAnsi="Times New Roman" w:eastAsia="Times New Roman"/>
           <w:sz w:val="18"/>
         </w:rPr>
-        <w:t>@dataclass</w:t>
+        <w:t>public sealed class WarrantyCase</w:t>
         <w:br/>
-      </w:r>
-      <w:r>
-        <w:rPr>
-          <w:rFonts w:ascii="Courier New" w:hAnsi="Courier New" w:eastAsia="Courier New"/>
+        <w:t>{</w:t>
+        <w:br/>
+        <w:t xml:space="preserve">    public string Id { get; set; } = string.Empty;</w:t>
+        <w:br/>
+        <w:t xml:space="preserve">    public string ClientName { get; set; } = string.Empty;</w:t>
+        <w:br/>
+        <w:t xml:space="preserve">    public string ProductName { get; set; } = string.Empty;</w:t>
+        <w:br/>
+        <w:t xml:space="preserve">    public string SerialNumber { get; set; } = string.Empty;</w:t>
+        <w:br/>
+        <w:t xml:space="preserve">    public string Status { get; set; } = "Принято";</w:t>
+        <w:br/>
+        <w:t xml:space="preserve">    public string TechnicalConclusion { get; set; } = string.Empty;</w:t>
+        <w:br/>
+        <w:t>}</w:t>
+        <w:br/>
+      </w:r>
+      <w:r>
+        <w:rPr>
+          <w:rFonts w:ascii="Times New Roman" w:hAnsi="Times New Roman" w:eastAsia="Times New Roman"/>
           <w:sz w:val="18"/>
         </w:rPr>
-        <w:t>class WarrantyCase:</w:t>
-        <w:br/>
-      </w:r>
-      <w:r>
-        <w:rPr>
-          <w:rFonts w:ascii="Courier New" w:hAnsi="Courier New" w:eastAsia="Courier New"/>
+      </w:r>
+      <w:r>
+        <w:rPr>
+          <w:rFonts w:ascii="Times New Roman" w:hAnsi="Times New Roman" w:eastAsia="Times New Roman"/>
           <w:sz w:val="18"/>
         </w:rPr>
-        <w:t xml:space="preserve">    Id: str</w:t>
-        <w:br/>
-      </w:r>
-      <w:r>
-        <w:rPr>
-          <w:rFonts w:ascii="Courier New" w:hAnsi="Courier New" w:eastAsia="Courier New"/>
+      </w:r>
+      <w:r>
+        <w:rPr>
+          <w:rFonts w:ascii="Times New Roman" w:hAnsi="Times New Roman" w:eastAsia="Times New Roman"/>
           <w:sz w:val="18"/>
         </w:rPr>
-        <w:t xml:space="preserve">    ClientName: str</w:t>
-        <w:br/>
-      </w:r>
-      <w:r>
-        <w:rPr>
-          <w:rFonts w:ascii="Courier New" w:hAnsi="Courier New" w:eastAsia="Courier New"/>
+      </w:r>
+      <w:r>
+        <w:rPr>
+          <w:rFonts w:ascii="Times New Roman" w:hAnsi="Times New Roman" w:eastAsia="Times New Roman"/>
           <w:sz w:val="18"/>
         </w:rPr>
-        <w:t xml:space="preserve">    ProductName: str</w:t>
-        <w:br/>
-      </w:r>
-      <w:r>
-        <w:rPr>
-          <w:rFonts w:ascii="Courier New" w:hAnsi="Courier New" w:eastAsia="Courier New"/>
+      </w:r>
+      <w:r>
+        <w:rPr>
+          <w:rFonts w:ascii="Times New Roman" w:hAnsi="Times New Roman" w:eastAsia="Times New Roman"/>
           <w:sz w:val="18"/>
         </w:rPr>
-        <w:t xml:space="preserve">    SerialNumber: str</w:t>
-        <w:br/>
-      </w:r>
-      <w:r>
-        <w:rPr>
-          <w:rFonts w:ascii="Courier New" w:hAnsi="Courier New" w:eastAsia="Courier New"/>
+      </w:r>
+      <w:r>
+        <w:rPr>
+          <w:rFonts w:ascii="Times New Roman" w:hAnsi="Times New Roman" w:eastAsia="Times New Roman"/>
           <w:sz w:val="18"/>
         </w:rPr>
-        <w:t xml:space="preserve">    Reason: str</w:t>
-        <w:br/>
-      </w:r>
-      <w:r>
-        <w:rPr>
-          <w:rFonts w:ascii="Courier New" w:hAnsi="Courier New" w:eastAsia="Courier New"/>
+      </w:r>
+      <w:r>
+        <w:rPr>
+          <w:rFonts w:ascii="Times New Roman" w:hAnsi="Times New Roman" w:eastAsia="Times New Roman"/>
           <w:sz w:val="18"/>
         </w:rPr>
-        <w:t xml:space="preserve">    Status: str</w:t>
-        <w:br/>
-      </w:r>
-      <w:r>
-        <w:rPr>
-          <w:rFonts w:ascii="Courier New" w:hAnsi="Courier New" w:eastAsia="Courier New"/>
+      </w:r>
+      <w:r>
+        <w:rPr>
+          <w:rFonts w:ascii="Times New Roman" w:hAnsi="Times New Roman" w:eastAsia="Times New Roman"/>
           <w:sz w:val="18"/>
         </w:rPr>
-        <w:t xml:space="preserve">    TechnicalConclusion: str</w:t>
-        <w:br/>
       </w:r>
     </w:p>
     <w:p>
@@ -30709,66 +30701,81 @@
       </w:pPr>
       <w:r>
         <w:rPr>
-          <w:rFonts w:ascii="Courier New" w:hAnsi="Courier New" w:eastAsia="Courier New"/>
+          <w:rFonts w:ascii="Times New Roman" w:hAnsi="Times New Roman" w:eastAsia="Times New Roman"/>
           <w:sz w:val="18"/>
         </w:rPr>
-        <w:t>class CaseStore:</w:t>
+        <w:t>public sealed class CaseStore</w:t>
         <w:br/>
-      </w:r>
-      <w:r>
-        <w:rPr>
-          <w:rFonts w:ascii="Courier New" w:hAnsi="Courier New" w:eastAsia="Courier New"/>
+        <w:t>{</w:t>
+        <w:br/>
+        <w:t xml:space="preserve">    private readonly string _localFile = Path.Combine(FileSystem.AppDataDirectory, "warranty_cases.json");</w:t>
+        <w:br/>
+        <w:br/>
+        <w:t xml:space="preserve">    public async Task&lt;List&lt;WarrantyCase&gt;&gt; LoadAsync()</w:t>
+        <w:br/>
+        <w:t xml:space="preserve">    {</w:t>
+        <w:br/>
+        <w:t xml:space="preserve">        var json = await File.ReadAllTextAsync(_localFile);</w:t>
+        <w:br/>
+        <w:t xml:space="preserve">        return JsonSerializer.Deserialize&lt;List&lt;WarrantyCase&gt;&gt;(json) ?? [];</w:t>
+        <w:br/>
+        <w:t xml:space="preserve">    }</w:t>
+        <w:br/>
+        <w:br/>
+        <w:t xml:space="preserve">    public async Task SaveAsync(IEnumerable&lt;WarrantyCase&gt; cases)</w:t>
+        <w:br/>
+        <w:t xml:space="preserve">    {</w:t>
+        <w:br/>
+        <w:t xml:space="preserve">        var json = JsonSerializer.Serialize(cases, JsonOptions);</w:t>
+        <w:br/>
+        <w:t xml:space="preserve">        await File.WriteAllTextAsync(_localFile, json);</w:t>
+        <w:br/>
+        <w:t xml:space="preserve">    }</w:t>
+        <w:br/>
+        <w:t>}</w:t>
+        <w:br/>
+      </w:r>
+      <w:r>
+        <w:rPr>
+          <w:rFonts w:ascii="Times New Roman" w:hAnsi="Times New Roman" w:eastAsia="Times New Roman"/>
           <w:sz w:val="18"/>
         </w:rPr>
-        <w:t xml:space="preserve">    def load(self) -&gt; list[WarrantyCase]:</w:t>
-        <w:br/>
-      </w:r>
-      <w:r>
-        <w:rPr>
-          <w:rFonts w:ascii="Courier New" w:hAnsi="Courier New" w:eastAsia="Courier New"/>
+      </w:r>
+      <w:r>
+        <w:rPr>
+          <w:rFonts w:ascii="Times New Roman" w:hAnsi="Times New Roman" w:eastAsia="Times New Roman"/>
           <w:sz w:val="18"/>
         </w:rPr>
-        <w:t xml:space="preserve">        data = json.loads(self.cloud_file.read_text(encoding="utf-8"))</w:t>
-        <w:br/>
-      </w:r>
-      <w:r>
-        <w:rPr>
-          <w:rFonts w:ascii="Courier New" w:hAnsi="Courier New" w:eastAsia="Courier New"/>
+      </w:r>
+      <w:r>
+        <w:rPr>
+          <w:rFonts w:ascii="Times New Roman" w:hAnsi="Times New Roman" w:eastAsia="Times New Roman"/>
           <w:sz w:val="18"/>
         </w:rPr>
-        <w:t xml:space="preserve">        return [WarrantyCase(**item) for item in data]</w:t>
-        <w:br/>
-      </w:r>
-      <w:r>
-        <w:rPr>
-          <w:rFonts w:ascii="Courier New" w:hAnsi="Courier New" w:eastAsia="Courier New"/>
+      </w:r>
+      <w:r>
+        <w:rPr>
+          <w:rFonts w:ascii="Times New Roman" w:hAnsi="Times New Roman" w:eastAsia="Times New Roman"/>
           <w:sz w:val="18"/>
         </w:rPr>
-        <w:br/>
-      </w:r>
-      <w:r>
-        <w:rPr>
-          <w:rFonts w:ascii="Courier New" w:hAnsi="Courier New" w:eastAsia="Courier New"/>
+      </w:r>
+      <w:r>
+        <w:rPr>
+          <w:rFonts w:ascii="Times New Roman" w:hAnsi="Times New Roman" w:eastAsia="Times New Roman"/>
           <w:sz w:val="18"/>
         </w:rPr>
-        <w:t xml:space="preserve">    def save(self, cases):</w:t>
-        <w:br/>
-      </w:r>
-      <w:r>
-        <w:rPr>
-          <w:rFonts w:ascii="Courier New" w:hAnsi="Courier New" w:eastAsia="Courier New"/>
+      </w:r>
+      <w:r>
+        <w:rPr>
+          <w:rFonts w:ascii="Times New Roman" w:hAnsi="Times New Roman" w:eastAsia="Times New Roman"/>
           <w:sz w:val="18"/>
         </w:rPr>
-        <w:t xml:space="preserve">        payload = [asdict(item) for item in cases]</w:t>
-        <w:br/>
-      </w:r>
-      <w:r>
-        <w:rPr>
-          <w:rFonts w:ascii="Courier New" w:hAnsi="Courier New" w:eastAsia="Courier New"/>
+      </w:r>
+      <w:r>
+        <w:rPr>
+          <w:rFonts w:ascii="Times New Roman" w:hAnsi="Times New Roman" w:eastAsia="Times New Roman"/>
           <w:sz w:val="18"/>
         </w:rPr>
-        <w:t xml:space="preserve">        self.cloud_file.write_text(json.dumps(payload, ensure_ascii=False, indent=2), encoding="utf-8")</w:t>
-        <w:br/>
       </w:r>
     </w:p>
     <w:p>
@@ -31551,7 +31558,7 @@
           <w:b w:val="0"/>
           <w:sz w:val="28"/>
         </w:rPr>
-        <w:t>Код разделён на классы по назначению, имена методов отражают выполняемые действия, повторяющиеся операции вынесены в сервисы. Для моделей используются свойства с понятными названиями. В Python-коде применены dataclass и отдельный класс CaseStore для работы с данными.</w:t>
+        <w:t>Код разделён на классы по назначению, имена методов отражают выполняемые действия, повторяющиеся операции вынесены в сервисы. Для моделей используются свойства с понятными названиями. В MAUI-коде применены C#-модели, XAML-страницы и отдельный класс CaseStore для работы с данными.</w:t>
       </w:r>
     </w:p>
     <w:p>
@@ -32141,14 +32148,19 @@
             <w:pPr>
               <w:spacing w:after="0" w:line="240" w:lineRule="auto"/>
             </w:pPr>
-            <w:r/>
-            <w:r>
-              <w:rPr>
-                <w:rFonts w:ascii="Times New Roman" w:hAnsi="Times New Roman" w:eastAsia="Times New Roman"/>
-                <w:b w:val="0"/>
-                <w:sz w:val="24"/>
-              </w:rPr>
-              <w:t>program/mobile-kivy</w:t>
+            <w:r>
+              <w:rPr>
+                <w:rFonts w:ascii="Times New Roman" w:hAnsi="Times New Roman" w:eastAsia="Times New Roman"/>
+                <w:sz w:val="28"/>
+              </w:rPr>
+              <w:t>program/mobile-maui</w:t>
+            </w:r>
+            <w:r>
+              <w:rPr>
+                <w:rFonts w:ascii="Times New Roman" w:hAnsi="Times New Roman" w:eastAsia="Times New Roman"/>
+                <w:b w:val="0"/>
+                <w:sz w:val="24"/>
+              </w:rPr>
             </w:r>
           </w:p>
         </w:tc>
@@ -33090,14 +33102,19 @@
             <w:pPr>
               <w:spacing w:after="0" w:line="240" w:lineRule="auto"/>
             </w:pPr>
-            <w:r/>
-            <w:r>
-              <w:rPr>
-                <w:rFonts w:ascii="Times New Roman" w:hAnsi="Times New Roman" w:eastAsia="Times New Roman"/>
-                <w:b w:val="0"/>
-                <w:sz w:val="24"/>
-              </w:rPr>
-              <w:t>Python 3.x</w:t>
+            <w:r>
+              <w:rPr>
+                <w:rFonts w:ascii="Times New Roman" w:hAnsi="Times New Roman" w:eastAsia="Times New Roman"/>
+                <w:sz w:val="24"/>
+              </w:rPr>
+              <w:t>.NET 8 SDK</w:t>
+            </w:r>
+            <w:r>
+              <w:rPr>
+                <w:rFonts w:ascii="Times New Roman" w:hAnsi="Times New Roman" w:eastAsia="Times New Roman"/>
+                <w:b w:val="0"/>
+                <w:sz w:val="24"/>
+              </w:rPr>
             </w:r>
           </w:p>
         </w:tc>
@@ -39792,7 +39809,7 @@
           <w:b w:val="0"/>
           <w:sz w:val="28"/>
         </w:rPr>
-        <w:t>Мобильное приложение подготавливается к распространению в виде APK-файла или запускается как Python/Kivy-прототип. Для демонстрации достаточно установить зависимости из requirements.txt и запустить main.py.</w:t>
+        <w:t>Мобильное приложение подготавливается к распространению в виде APK-файла через Visual Studio. Для демонстрации необходимо открыть WarrantyReturns.sln, выбрать проект WarrantyReturns.Mobile и запустить его на Android Emulator.</w:t>
       </w:r>
     </w:p>
     <w:p>
@@ -39802,27 +39819,29 @@
       </w:pPr>
       <w:r>
         <w:rPr>
-          <w:rFonts w:ascii="Courier New" w:hAnsi="Courier New" w:eastAsia="Courier New"/>
+          <w:rFonts w:ascii="Times New Roman" w:hAnsi="Times New Roman" w:eastAsia="Times New Roman"/>
           <w:sz w:val="18"/>
         </w:rPr>
-        <w:t>cd program/mobile-kivy</w:t>
+        <w:t>Открыть program/WarrantyReturns.sln в Visual Studio 2022</w:t>
         <w:br/>
-      </w:r>
-      <w:r>
-        <w:rPr>
-          <w:rFonts w:ascii="Courier New" w:hAnsi="Courier New" w:eastAsia="Courier New"/>
+        <w:t>Выбрать проект WarrantyReturns.Mobile</w:t>
+        <w:br/>
+        <w:t>Выбрать Android Emulator</w:t>
+        <w:br/>
+        <w:t>Нажать Start Debugging</w:t>
+        <w:br/>
+      </w:r>
+      <w:r>
+        <w:rPr>
+          <w:rFonts w:ascii="Times New Roman" w:hAnsi="Times New Roman" w:eastAsia="Times New Roman"/>
           <w:sz w:val="18"/>
         </w:rPr>
-        <w:t>python -m pip install -r requirements.txt</w:t>
-        <w:br/>
-      </w:r>
-      <w:r>
-        <w:rPr>
-          <w:rFonts w:ascii="Courier New" w:hAnsi="Courier New" w:eastAsia="Courier New"/>
+      </w:r>
+      <w:r>
+        <w:rPr>
+          <w:rFonts w:ascii="Times New Roman" w:hAnsi="Times New Roman" w:eastAsia="Times New Roman"/>
           <w:sz w:val="18"/>
         </w:rPr>
-        <w:t>python main.py</w:t>
-        <w:br/>
       </w:r>
     </w:p>
     <w:p>
@@ -40392,14 +40411,19 @@
             <w:pPr>
               <w:spacing w:after="0" w:line="240" w:lineRule="auto"/>
             </w:pPr>
-            <w:r/>
-            <w:r>
-              <w:rPr>
-                <w:rFonts w:ascii="Times New Roman" w:hAnsi="Times New Roman" w:eastAsia="Times New Roman"/>
-                <w:b w:val="0"/>
-                <w:sz w:val="24"/>
-              </w:rPr>
-              <w:t>Запуск Kivy-приложения</w:t>
+            <w:r>
+              <w:rPr>
+                <w:rFonts w:ascii="Times New Roman" w:hAnsi="Times New Roman" w:eastAsia="Times New Roman"/>
+                <w:sz w:val="28"/>
+              </w:rPr>
+              <w:t>Запуск .NET MAUI-приложения</w:t>
+            </w:r>
+            <w:r>
+              <w:rPr>
+                <w:rFonts w:ascii="Times New Roman" w:hAnsi="Times New Roman" w:eastAsia="Times New Roman"/>
+                <w:b w:val="0"/>
+                <w:sz w:val="24"/>
+              </w:rPr>
             </w:r>
           </w:p>
         </w:tc>
@@ -41436,58 +41460,58 @@
       </w:pPr>
       <w:r>
         <w:rPr>
-          <w:rFonts w:ascii="Courier New" w:hAnsi="Courier New" w:eastAsia="Courier New"/>
+          <w:rFonts w:ascii="Times New Roman" w:hAnsi="Times New Roman" w:eastAsia="Times New Roman"/>
           <w:sz w:val="18"/>
         </w:rPr>
         <w:t># Changelog</w:t>
         <w:br/>
-      </w:r>
-      <w:r>
-        <w:rPr>
-          <w:rFonts w:ascii="Courier New" w:hAnsi="Courier New" w:eastAsia="Courier New"/>
-          <w:sz w:val="18"/>
-        </w:rPr>
         <w:br/>
-      </w:r>
-      <w:r>
-        <w:rPr>
-          <w:rFonts w:ascii="Courier New" w:hAnsi="Courier New" w:eastAsia="Courier New"/>
-          <w:sz w:val="18"/>
-        </w:rPr>
         <w:t>## 1.0.0</w:t>
         <w:br/>
-      </w:r>
-      <w:r>
-        <w:rPr>
-          <w:rFonts w:ascii="Courier New" w:hAnsi="Courier New" w:eastAsia="Courier New"/>
-          <w:sz w:val="18"/>
-        </w:rPr>
         <w:t>- Добавлена WPF-версия менеджера</w:t>
         <w:br/>
-      </w:r>
-      <w:r>
-        <w:rPr>
-          <w:rFonts w:ascii="Courier New" w:hAnsi="Courier New" w:eastAsia="Courier New"/>
-          <w:sz w:val="18"/>
-        </w:rPr>
-        <w:t>- Добавлена мобильная Kivy-версия инженера</w:t>
+        <w:t>- Добавлена мобильная .NET MAUI-версия инженера</w:t>
         <w:br/>
-      </w:r>
-      <w:r>
-        <w:rPr>
-          <w:rFonts w:ascii="Courier New" w:hAnsi="Courier New" w:eastAsia="Courier New"/>
-          <w:sz w:val="18"/>
-        </w:rPr>
         <w:t>- Реализован экспорт DOCX/XLSX</w:t>
         <w:br/>
-      </w:r>
-      <w:r>
-        <w:rPr>
-          <w:rFonts w:ascii="Courier New" w:hAnsi="Courier New" w:eastAsia="Courier New"/>
-          <w:sz w:val="18"/>
-        </w:rPr>
         <w:t>- Добавлена синхронизация через JSON</w:t>
         <w:br/>
+      </w:r>
+      <w:r>
+        <w:rPr>
+          <w:rFonts w:ascii="Times New Roman" w:hAnsi="Times New Roman" w:eastAsia="Times New Roman"/>
+          <w:sz w:val="18"/>
+        </w:rPr>
+      </w:r>
+      <w:r>
+        <w:rPr>
+          <w:rFonts w:ascii="Times New Roman" w:hAnsi="Times New Roman" w:eastAsia="Times New Roman"/>
+          <w:sz w:val="18"/>
+        </w:rPr>
+      </w:r>
+      <w:r>
+        <w:rPr>
+          <w:rFonts w:ascii="Times New Roman" w:hAnsi="Times New Roman" w:eastAsia="Times New Roman"/>
+          <w:sz w:val="18"/>
+        </w:rPr>
+      </w:r>
+      <w:r>
+        <w:rPr>
+          <w:rFonts w:ascii="Times New Roman" w:hAnsi="Times New Roman" w:eastAsia="Times New Roman"/>
+          <w:sz w:val="18"/>
+        </w:rPr>
+      </w:r>
+      <w:r>
+        <w:rPr>
+          <w:rFonts w:ascii="Times New Roman" w:hAnsi="Times New Roman" w:eastAsia="Times New Roman"/>
+          <w:sz w:val="18"/>
+        </w:rPr>
+      </w:r>
+      <w:r>
+        <w:rPr>
+          <w:rFonts w:ascii="Times New Roman" w:hAnsi="Times New Roman" w:eastAsia="Times New Roman"/>
+          <w:sz w:val="18"/>
+        </w:rPr>
       </w:r>
     </w:p>
     <w:p>
@@ -42827,14 +42851,19 @@
             <w:pPr>
               <w:spacing w:after="0" w:line="240" w:lineRule="auto"/>
             </w:pPr>
-            <w:r/>
-            <w:r>
-              <w:rPr>
-                <w:rFonts w:ascii="Times New Roman" w:hAnsi="Times New Roman" w:eastAsia="Times New Roman"/>
-                <w:b w:val="0"/>
-                <w:sz w:val="24"/>
-              </w:rPr>
-              <w:t>Android 8+ или ПК с Python</w:t>
+            <w:r>
+              <w:rPr>
+                <w:rFonts w:ascii="Times New Roman" w:hAnsi="Times New Roman" w:eastAsia="Times New Roman"/>
+                <w:sz w:val="24"/>
+              </w:rPr>
+              <w:t>Android 8+ или ПК с C# / .NET MAUI</w:t>
+            </w:r>
+            <w:r>
+              <w:rPr>
+                <w:rFonts w:ascii="Times New Roman" w:hAnsi="Times New Roman" w:eastAsia="Times New Roman"/>
+                <w:b w:val="0"/>
+                <w:sz w:val="24"/>
+              </w:rPr>
             </w:r>
           </w:p>
         </w:tc>
@@ -42849,14 +42878,19 @@
             <w:pPr>
               <w:spacing w:after="0" w:line="240" w:lineRule="auto"/>
             </w:pPr>
-            <w:r/>
-            <w:r>
-              <w:rPr>
-                <w:rFonts w:ascii="Times New Roman" w:hAnsi="Times New Roman" w:eastAsia="Times New Roman"/>
-                <w:b w:val="0"/>
-                <w:sz w:val="24"/>
-              </w:rPr>
-              <w:t>Python</w:t>
+            <w:r>
+              <w:rPr>
+                <w:rFonts w:ascii="Times New Roman" w:hAnsi="Times New Roman" w:eastAsia="Times New Roman"/>
+                <w:sz w:val="24"/>
+              </w:rPr>
+              <w:t>C# / .NET MAUI</w:t>
+            </w:r>
+            <w:r>
+              <w:rPr>
+                <w:rFonts w:ascii="Times New Roman" w:hAnsi="Times New Roman" w:eastAsia="Times New Roman"/>
+                <w:b w:val="0"/>
+                <w:sz w:val="24"/>
+              </w:rPr>
             </w:r>
           </w:p>
         </w:tc>
@@ -43034,7 +43068,7 @@
           <w:b w:val="0"/>
           <w:sz w:val="28"/>
         </w:rPr>
-        <w:t>Для запуска десктопной версии необходимо открыть проект в Visual Studio и выполнить команду запуска либо использовать собранный исполняемый файл. Для мобильного прототипа необходимо перейти в каталог mobile-kivy, установить зависимости и выполнить python main.py.</w:t>
+        <w:t>Для запуска десктопной версии необходимо открыть решение WarrantyReturns.sln в Visual Studio и выбрать проект WarrantyReturns.Desktop. Для мобильной версии необходимо выбрать проект WarrantyReturns.Mobile, Android Emulator или подключённое устройство и нажать Start Debugging.</w:t>
       </w:r>
     </w:p>
     <w:p>
@@ -47661,7 +47695,7 @@
           <w:b w:val="0"/>
           <w:sz w:val="28"/>
         </w:rPr>
-        <w:t>Документация Python. – Режим доступа: https://docs.python.org/3/ (дата обращения: 10.06.2026).</w:t>
+        <w:t>Документация .NET MAUI. – Режим доступа: https://learn.microsoft.com/dotnet/maui/ (дата обращения: 10.06.2026).</w:t>
       </w:r>
     </w:p>
     <w:p>
@@ -47675,7 +47709,7 @@
           <w:b w:val="0"/>
           <w:sz w:val="28"/>
         </w:rPr>
-        <w:t>Документация Kivy. – Режим доступа: https://kivy.org/doc/stable/ (дата обращения: 10.06.2026).</w:t>
+        <w:t>Документация Visual Studio. – Режим доступа: https://learn.microsoft.com/visualstudio/ (дата обращения: 10.06.2026).</w:t>
       </w:r>
     </w:p>
     <w:p>

</xml_diff>

<commit_message>
Complete variant 8 requirements coverage
Co-authored-by: nikita4lost <nikita4lost@users.noreply.github.com>
</commit_message>
<xml_diff>
--- a/otchet_mikhailov_nikita.docx
+++ b/otchet_mikhailov_nikita.docx
@@ -47754,6 +47754,1173 @@
         <w:t>Документация Git. – Режим доступа: https://git-scm.com/doc (дата обращения: 10.06.2026).</w:t>
       </w:r>
     </w:p>
+    <w:p>
+      <w:pPr>
+        <w:spacing w:line="360" w:lineRule="auto" w:before="200" w:after="80"/>
+        <w:jc w:val="center"/>
+      </w:pPr>
+      <w:r>
+        <w:rPr>
+          <w:rFonts w:ascii="Times New Roman" w:hAnsi="Times New Roman" w:eastAsia="Times New Roman"/>
+          <w:b/>
+          <w:sz w:val="28"/>
+        </w:rPr>
+        <w:t>ПРИЛОЖЕНИЕ Д</w:t>
+      </w:r>
+    </w:p>
+    <w:p>
+      <w:pPr>
+        <w:spacing w:line="360" w:lineRule="auto" w:before="200" w:after="80"/>
+        <w:jc w:val="center"/>
+      </w:pPr>
+      <w:r>
+        <w:rPr>
+          <w:rFonts w:ascii="Times New Roman" w:hAnsi="Times New Roman" w:eastAsia="Times New Roman"/>
+          <w:b/>
+          <w:sz w:val="28"/>
+        </w:rPr>
+        <w:t>Проверка соответствия варианту 8</w:t>
+      </w:r>
+    </w:p>
+    <w:tbl>
+      <w:tblPr>
+        <w:tblW w:type="auto" w:w="0"/>
+        <w:jc w:val="center"/>
+        <w:tblLook w:firstColumn="1" w:firstRow="1" w:lastColumn="0" w:lastRow="0" w:noHBand="0" w:noVBand="1" w:val="04A0"/>
+        <w:tblBorders>
+          <w:top w:val="single" w:sz="6" w:space="0" w:color="000000"/>
+          <w:left w:val="single" w:sz="6" w:space="0" w:color="000000"/>
+          <w:bottom w:val="single" w:sz="6" w:space="0" w:color="000000"/>
+          <w:right w:val="single" w:sz="6" w:space="0" w:color="000000"/>
+          <w:insideH w:val="single" w:sz="6" w:space="0" w:color="000000"/>
+          <w:insideV w:val="single" w:sz="6" w:space="0" w:color="000000"/>
+        </w:tblBorders>
+      </w:tblPr>
+      <w:tblGrid>
+        <w:gridCol w:w="3118"/>
+        <w:gridCol w:w="3118"/>
+        <w:gridCol w:w="3118"/>
+      </w:tblGrid>
+      <w:tr>
+        <w:tc>
+          <w:tcPr>
+            <w:tcW w:type="dxa" w:w="3118"/>
+            <w:shd w:fill="D9EAF7"/>
+            <w:vAlign w:val="center"/>
+          </w:tcPr>
+          <w:p>
+            <w:pPr>
+              <w:spacing w:after="0" w:line="240" w:lineRule="auto"/>
+            </w:pPr>
+            <w:r/>
+            <w:r>
+              <w:rPr>
+                <w:rFonts w:ascii="Times New Roman" w:hAnsi="Times New Roman" w:eastAsia="Times New Roman"/>
+                <w:b/>
+                <w:sz w:val="22"/>
+              </w:rPr>
+              <w:t>Требование варианта 8</w:t>
+            </w:r>
+          </w:p>
+        </w:tc>
+        <w:tc>
+          <w:tcPr>
+            <w:tcW w:type="dxa" w:w="3118"/>
+            <w:shd w:fill="D9EAF7"/>
+            <w:vAlign w:val="center"/>
+          </w:tcPr>
+          <w:p>
+            <w:pPr>
+              <w:spacing w:after="0" w:line="240" w:lineRule="auto"/>
+            </w:pPr>
+            <w:r/>
+            <w:r>
+              <w:rPr>
+                <w:rFonts w:ascii="Times New Roman" w:hAnsi="Times New Roman" w:eastAsia="Times New Roman"/>
+                <w:b/>
+                <w:sz w:val="22"/>
+              </w:rPr>
+              <w:t>Реализация</w:t>
+            </w:r>
+          </w:p>
+        </w:tc>
+        <w:tc>
+          <w:tcPr>
+            <w:tcW w:type="dxa" w:w="3118"/>
+            <w:shd w:fill="D9EAF7"/>
+            <w:vAlign w:val="center"/>
+          </w:tcPr>
+          <w:p>
+            <w:pPr>
+              <w:spacing w:after="0" w:line="240" w:lineRule="auto"/>
+            </w:pPr>
+            <w:r/>
+            <w:r>
+              <w:rPr>
+                <w:rFonts w:ascii="Times New Roman" w:hAnsi="Times New Roman" w:eastAsia="Times New Roman"/>
+                <w:b/>
+                <w:sz w:val="22"/>
+              </w:rPr>
+              <w:t>Статус</w:t>
+            </w:r>
+          </w:p>
+        </w:tc>
+      </w:tr>
+      <w:tr>
+        <w:tc>
+          <w:tcPr>
+            <w:tcW w:type="dxa" w:w="3118"/>
+            <w:vAlign w:val="center"/>
+          </w:tcPr>
+          <w:p>
+            <w:pPr>
+              <w:spacing w:after="0" w:line="240" w:lineRule="auto"/>
+            </w:pPr>
+            <w:r/>
+            <w:r>
+              <w:rPr>
+                <w:rFonts w:ascii="Times New Roman" w:hAnsi="Times New Roman" w:eastAsia="Times New Roman"/>
+                <w:b w:val="0"/>
+                <w:sz w:val="22"/>
+              </w:rPr>
+              <w:t>CRUD возвратов и рекламаций</w:t>
+            </w:r>
+          </w:p>
+        </w:tc>
+        <w:tc>
+          <w:tcPr>
+            <w:tcW w:type="dxa" w:w="3118"/>
+            <w:vAlign w:val="center"/>
+          </w:tcPr>
+          <w:p>
+            <w:pPr>
+              <w:spacing w:after="0" w:line="240" w:lineRule="auto"/>
+            </w:pPr>
+            <w:r/>
+            <w:r>
+              <w:rPr>
+                <w:rFonts w:ascii="Times New Roman" w:hAnsi="Times New Roman" w:eastAsia="Times New Roman"/>
+                <w:b w:val="0"/>
+                <w:sz w:val="22"/>
+              </w:rPr>
+              <w:t>Десктоп: добавление, редактирование, поиск, фильтр, сортировка DataGrid, удаление</w:t>
+            </w:r>
+          </w:p>
+        </w:tc>
+        <w:tc>
+          <w:tcPr>
+            <w:tcW w:type="dxa" w:w="3118"/>
+            <w:vAlign w:val="center"/>
+          </w:tcPr>
+          <w:p>
+            <w:pPr>
+              <w:spacing w:after="0" w:line="240" w:lineRule="auto"/>
+            </w:pPr>
+            <w:r/>
+            <w:r>
+              <w:rPr>
+                <w:rFonts w:ascii="Times New Roman" w:hAnsi="Times New Roman" w:eastAsia="Times New Roman"/>
+                <w:b w:val="0"/>
+                <w:sz w:val="22"/>
+              </w:rPr>
+              <w:t>Выполнено</w:t>
+            </w:r>
+          </w:p>
+        </w:tc>
+      </w:tr>
+      <w:tr>
+        <w:tc>
+          <w:tcPr>
+            <w:tcW w:type="dxa" w:w="3118"/>
+            <w:vAlign w:val="center"/>
+          </w:tcPr>
+          <w:p>
+            <w:pPr>
+              <w:spacing w:after="0" w:line="240" w:lineRule="auto"/>
+            </w:pPr>
+            <w:r/>
+            <w:r>
+              <w:rPr>
+                <w:rFonts w:ascii="Times New Roman" w:hAnsi="Times New Roman" w:eastAsia="Times New Roman"/>
+                <w:b w:val="0"/>
+                <w:sz w:val="22"/>
+              </w:rPr>
+              <w:t>Поля заявки</w:t>
+            </w:r>
+          </w:p>
+        </w:tc>
+        <w:tc>
+          <w:tcPr>
+            <w:tcW w:type="dxa" w:w="3118"/>
+            <w:vAlign w:val="center"/>
+          </w:tcPr>
+          <w:p>
+            <w:pPr>
+              <w:spacing w:after="0" w:line="240" w:lineRule="auto"/>
+            </w:pPr>
+            <w:r/>
+            <w:r>
+              <w:rPr>
+                <w:rFonts w:ascii="Times New Roman" w:hAnsi="Times New Roman" w:eastAsia="Times New Roman"/>
+                <w:b w:val="0"/>
+                <w:sz w:val="22"/>
+              </w:rPr>
+              <w:t>ID, клиент, телефон, товар, серийный номер, причина, статус, дата приёма, сумма</w:t>
+            </w:r>
+          </w:p>
+        </w:tc>
+        <w:tc>
+          <w:tcPr>
+            <w:tcW w:type="dxa" w:w="3118"/>
+            <w:vAlign w:val="center"/>
+          </w:tcPr>
+          <w:p>
+            <w:pPr>
+              <w:spacing w:after="0" w:line="240" w:lineRule="auto"/>
+            </w:pPr>
+            <w:r/>
+            <w:r>
+              <w:rPr>
+                <w:rFonts w:ascii="Times New Roman" w:hAnsi="Times New Roman" w:eastAsia="Times New Roman"/>
+                <w:b w:val="0"/>
+                <w:sz w:val="22"/>
+              </w:rPr>
+              <w:t>Выполнено</w:t>
+            </w:r>
+          </w:p>
+        </w:tc>
+      </w:tr>
+      <w:tr>
+        <w:tc>
+          <w:tcPr>
+            <w:tcW w:type="dxa" w:w="3118"/>
+            <w:vAlign w:val="center"/>
+          </w:tcPr>
+          <w:p>
+            <w:pPr>
+              <w:spacing w:after="0" w:line="240" w:lineRule="auto"/>
+            </w:pPr>
+            <w:r/>
+            <w:r>
+              <w:rPr>
+                <w:rFonts w:ascii="Times New Roman" w:hAnsi="Times New Roman" w:eastAsia="Times New Roman"/>
+                <w:b w:val="0"/>
+                <w:sz w:val="22"/>
+              </w:rPr>
+              <w:t>Валидация</w:t>
+            </w:r>
+          </w:p>
+        </w:tc>
+        <w:tc>
+          <w:tcPr>
+            <w:tcW w:type="dxa" w:w="3118"/>
+            <w:vAlign w:val="center"/>
+          </w:tcPr>
+          <w:p>
+            <w:pPr>
+              <w:spacing w:after="0" w:line="240" w:lineRule="auto"/>
+            </w:pPr>
+            <w:r/>
+            <w:r>
+              <w:rPr>
+                <w:rFonts w:ascii="Times New Roman" w:hAnsi="Times New Roman" w:eastAsia="Times New Roman"/>
+                <w:b w:val="0"/>
+                <w:sz w:val="22"/>
+              </w:rPr>
+              <w:t>ФИО/название, телефон +7, справочники, сумма &gt;= 0, длина комментариев</w:t>
+            </w:r>
+          </w:p>
+        </w:tc>
+        <w:tc>
+          <w:tcPr>
+            <w:tcW w:type="dxa" w:w="3118"/>
+            <w:vAlign w:val="center"/>
+          </w:tcPr>
+          <w:p>
+            <w:pPr>
+              <w:spacing w:after="0" w:line="240" w:lineRule="auto"/>
+            </w:pPr>
+            <w:r/>
+            <w:r>
+              <w:rPr>
+                <w:rFonts w:ascii="Times New Roman" w:hAnsi="Times New Roman" w:eastAsia="Times New Roman"/>
+                <w:b w:val="0"/>
+                <w:sz w:val="22"/>
+              </w:rPr>
+              <w:t>Выполнено</w:t>
+            </w:r>
+          </w:p>
+        </w:tc>
+      </w:tr>
+      <w:tr>
+        <w:tc>
+          <w:tcPr>
+            <w:tcW w:type="dxa" w:w="3118"/>
+            <w:vAlign w:val="center"/>
+          </w:tcPr>
+          <w:p>
+            <w:pPr>
+              <w:spacing w:after="0" w:line="240" w:lineRule="auto"/>
+            </w:pPr>
+            <w:r/>
+            <w:r>
+              <w:rPr>
+                <w:rFonts w:ascii="Times New Roman" w:hAnsi="Times New Roman" w:eastAsia="Times New Roman"/>
+                <w:b w:val="0"/>
+                <w:sz w:val="22"/>
+              </w:rPr>
+              <w:t>Внутренний/внешний комментарий</w:t>
+            </w:r>
+          </w:p>
+        </w:tc>
+        <w:tc>
+          <w:tcPr>
+            <w:tcW w:type="dxa" w:w="3118"/>
+            <w:vAlign w:val="center"/>
+          </w:tcPr>
+          <w:p>
+            <w:pPr>
+              <w:spacing w:after="0" w:line="240" w:lineRule="auto"/>
+            </w:pPr>
+            <w:r/>
+            <w:r>
+              <w:rPr>
+                <w:rFonts w:ascii="Times New Roman" w:hAnsi="Times New Roman" w:eastAsia="Times New Roman"/>
+                <w:b w:val="0"/>
+                <w:sz w:val="22"/>
+              </w:rPr>
+              <w:t>Отдельные поля InternalComment и ExternalComment; внешний показывается инженеру</w:t>
+            </w:r>
+          </w:p>
+        </w:tc>
+        <w:tc>
+          <w:tcPr>
+            <w:tcW w:type="dxa" w:w="3118"/>
+            <w:vAlign w:val="center"/>
+          </w:tcPr>
+          <w:p>
+            <w:pPr>
+              <w:spacing w:after="0" w:line="240" w:lineRule="auto"/>
+            </w:pPr>
+            <w:r/>
+            <w:r>
+              <w:rPr>
+                <w:rFonts w:ascii="Times New Roman" w:hAnsi="Times New Roman" w:eastAsia="Times New Roman"/>
+                <w:b w:val="0"/>
+                <w:sz w:val="22"/>
+              </w:rPr>
+              <w:t>Выполнено</w:t>
+            </w:r>
+          </w:p>
+        </w:tc>
+      </w:tr>
+      <w:tr>
+        <w:tc>
+          <w:tcPr>
+            <w:tcW w:type="dxa" w:w="3118"/>
+            <w:vAlign w:val="center"/>
+          </w:tcPr>
+          <w:p>
+            <w:pPr>
+              <w:spacing w:after="0" w:line="240" w:lineRule="auto"/>
+            </w:pPr>
+            <w:r/>
+            <w:r>
+              <w:rPr>
+                <w:rFonts w:ascii="Times New Roman" w:hAnsi="Times New Roman" w:eastAsia="Times New Roman"/>
+                <w:b w:val="0"/>
+                <w:sz w:val="22"/>
+              </w:rPr>
+              <w:t>Структурированное логирование</w:t>
+            </w:r>
+          </w:p>
+        </w:tc>
+        <w:tc>
+          <w:tcPr>
+            <w:tcW w:type="dxa" w:w="3118"/>
+            <w:vAlign w:val="center"/>
+          </w:tcPr>
+          <w:p>
+            <w:pPr>
+              <w:spacing w:after="0" w:line="240" w:lineRule="auto"/>
+            </w:pPr>
+            <w:r/>
+            <w:r>
+              <w:rPr>
+                <w:rFonts w:ascii="Times New Roman" w:hAnsi="Times New Roman" w:eastAsia="Times New Roman"/>
+                <w:b w:val="0"/>
+                <w:sz w:val="22"/>
+              </w:rPr>
+              <w:t>Локальный app.log с INFO/WARNING и временем операции</w:t>
+            </w:r>
+          </w:p>
+        </w:tc>
+        <w:tc>
+          <w:tcPr>
+            <w:tcW w:type="dxa" w:w="3118"/>
+            <w:vAlign w:val="center"/>
+          </w:tcPr>
+          <w:p>
+            <w:pPr>
+              <w:spacing w:after="0" w:line="240" w:lineRule="auto"/>
+            </w:pPr>
+            <w:r/>
+            <w:r>
+              <w:rPr>
+                <w:rFonts w:ascii="Times New Roman" w:hAnsi="Times New Roman" w:eastAsia="Times New Roman"/>
+                <w:b w:val="0"/>
+                <w:sz w:val="22"/>
+              </w:rPr>
+              <w:t>Выполнено</w:t>
+            </w:r>
+          </w:p>
+        </w:tc>
+      </w:tr>
+      <w:tr>
+        <w:tc>
+          <w:tcPr>
+            <w:tcW w:type="dxa" w:w="3118"/>
+            <w:vAlign w:val="center"/>
+          </w:tcPr>
+          <w:p>
+            <w:pPr>
+              <w:spacing w:after="0" w:line="240" w:lineRule="auto"/>
+            </w:pPr>
+            <w:r/>
+            <w:r>
+              <w:rPr>
+                <w:rFonts w:ascii="Times New Roman" w:hAnsi="Times New Roman" w:eastAsia="Times New Roman"/>
+                <w:b w:val="0"/>
+                <w:sz w:val="22"/>
+              </w:rPr>
+              <w:t>Экспорт Word/Excel</w:t>
+            </w:r>
+          </w:p>
+        </w:tc>
+        <w:tc>
+          <w:tcPr>
+            <w:tcW w:type="dxa" w:w="3118"/>
+            <w:vAlign w:val="center"/>
+          </w:tcPr>
+          <w:p>
+            <w:pPr>
+              <w:spacing w:after="0" w:line="240" w:lineRule="auto"/>
+            </w:pPr>
+            <w:r/>
+            <w:r>
+              <w:rPr>
+                <w:rFonts w:ascii="Times New Roman" w:hAnsi="Times New Roman" w:eastAsia="Times New Roman"/>
+                <w:b w:val="0"/>
+                <w:sz w:val="22"/>
+              </w:rPr>
+              <w:t>DOCX/XLSX с полями реестра, сортировкой/группировкой по статусам</w:t>
+            </w:r>
+          </w:p>
+        </w:tc>
+        <w:tc>
+          <w:tcPr>
+            <w:tcW w:type="dxa" w:w="3118"/>
+            <w:vAlign w:val="center"/>
+          </w:tcPr>
+          <w:p>
+            <w:pPr>
+              <w:spacing w:after="0" w:line="240" w:lineRule="auto"/>
+            </w:pPr>
+            <w:r/>
+            <w:r>
+              <w:rPr>
+                <w:rFonts w:ascii="Times New Roman" w:hAnsi="Times New Roman" w:eastAsia="Times New Roman"/>
+                <w:b w:val="0"/>
+                <w:sz w:val="22"/>
+              </w:rPr>
+              <w:t>Выполнено</w:t>
+            </w:r>
+          </w:p>
+        </w:tc>
+      </w:tr>
+      <w:tr>
+        <w:tc>
+          <w:tcPr>
+            <w:tcW w:type="dxa" w:w="3118"/>
+            <w:vAlign w:val="center"/>
+          </w:tcPr>
+          <w:p>
+            <w:pPr>
+              <w:spacing w:after="0" w:line="240" w:lineRule="auto"/>
+            </w:pPr>
+            <w:r/>
+            <w:r>
+              <w:rPr>
+                <w:rFonts w:ascii="Times New Roman" w:hAnsi="Times New Roman" w:eastAsia="Times New Roman"/>
+                <w:b w:val="0"/>
+                <w:sz w:val="22"/>
+              </w:rPr>
+              <w:t>Синхронизация</w:t>
+            </w:r>
+          </w:p>
+        </w:tc>
+        <w:tc>
+          <w:tcPr>
+            <w:tcW w:type="dxa" w:w="3118"/>
+            <w:vAlign w:val="center"/>
+          </w:tcPr>
+          <w:p>
+            <w:pPr>
+              <w:spacing w:after="0" w:line="240" w:lineRule="auto"/>
+            </w:pPr>
+            <w:r/>
+            <w:r>
+              <w:rPr>
+                <w:rFonts w:ascii="Times New Roman" w:hAnsi="Times New Roman" w:eastAsia="Times New Roman"/>
+                <w:b w:val="0"/>
+                <w:sz w:val="22"/>
+              </w:rPr>
+              <w:t>Демонстрационный JSON-аналог облака, выгрузка из десктопа и локальное MAUI-хранилище</w:t>
+            </w:r>
+          </w:p>
+        </w:tc>
+        <w:tc>
+          <w:tcPr>
+            <w:tcW w:type="dxa" w:w="3118"/>
+            <w:vAlign w:val="center"/>
+          </w:tcPr>
+          <w:p>
+            <w:pPr>
+              <w:spacing w:after="0" w:line="240" w:lineRule="auto"/>
+            </w:pPr>
+            <w:r/>
+            <w:r>
+              <w:rPr>
+                <w:rFonts w:ascii="Times New Roman" w:hAnsi="Times New Roman" w:eastAsia="Times New Roman"/>
+                <w:b w:val="0"/>
+                <w:sz w:val="22"/>
+              </w:rPr>
+              <w:t>Демонстрационно</w:t>
+            </w:r>
+          </w:p>
+        </w:tc>
+      </w:tr>
+      <w:tr>
+        <w:tc>
+          <w:tcPr>
+            <w:tcW w:type="dxa" w:w="3118"/>
+            <w:vAlign w:val="center"/>
+          </w:tcPr>
+          <w:p>
+            <w:pPr>
+              <w:spacing w:after="0" w:line="240" w:lineRule="auto"/>
+            </w:pPr>
+            <w:r/>
+            <w:r>
+              <w:rPr>
+                <w:rFonts w:ascii="Times New Roman" w:hAnsi="Times New Roman" w:eastAsia="Times New Roman"/>
+                <w:b w:val="0"/>
+                <w:sz w:val="22"/>
+              </w:rPr>
+              <w:t>Аналитика</w:t>
+            </w:r>
+          </w:p>
+        </w:tc>
+        <w:tc>
+          <w:tcPr>
+            <w:tcW w:type="dxa" w:w="3118"/>
+            <w:vAlign w:val="center"/>
+          </w:tcPr>
+          <w:p>
+            <w:pPr>
+              <w:spacing w:after="0" w:line="240" w:lineRule="auto"/>
+            </w:pPr>
+            <w:r/>
+            <w:r>
+              <w:rPr>
+                <w:rFonts w:ascii="Times New Roman" w:hAnsi="Times New Roman" w:eastAsia="Times New Roman"/>
+                <w:b w:val="0"/>
+                <w:sz w:val="22"/>
+              </w:rPr>
+              <w:t>Кнопка «Аналитика»: причины, статусы, суммы, период</w:t>
+            </w:r>
+          </w:p>
+        </w:tc>
+        <w:tc>
+          <w:tcPr>
+            <w:tcW w:type="dxa" w:w="3118"/>
+            <w:vAlign w:val="center"/>
+          </w:tcPr>
+          <w:p>
+            <w:pPr>
+              <w:spacing w:after="0" w:line="240" w:lineRule="auto"/>
+            </w:pPr>
+            <w:r/>
+            <w:r>
+              <w:rPr>
+                <w:rFonts w:ascii="Times New Roman" w:hAnsi="Times New Roman" w:eastAsia="Times New Roman"/>
+                <w:b w:val="0"/>
+                <w:sz w:val="22"/>
+              </w:rPr>
+              <w:t>Выполнено</w:t>
+            </w:r>
+          </w:p>
+        </w:tc>
+      </w:tr>
+      <w:tr>
+        <w:tc>
+          <w:tcPr>
+            <w:tcW w:type="dxa" w:w="3118"/>
+            <w:vAlign w:val="center"/>
+          </w:tcPr>
+          <w:p>
+            <w:pPr>
+              <w:spacing w:after="0" w:line="240" w:lineRule="auto"/>
+            </w:pPr>
+            <w:r/>
+            <w:r>
+              <w:rPr>
+                <w:rFonts w:ascii="Times New Roman" w:hAnsi="Times New Roman" w:eastAsia="Times New Roman"/>
+                <w:b w:val="0"/>
+                <w:sz w:val="22"/>
+              </w:rPr>
+              <w:t>Мобильная авторизация engineer</w:t>
+            </w:r>
+          </w:p>
+        </w:tc>
+        <w:tc>
+          <w:tcPr>
+            <w:tcW w:type="dxa" w:w="3118"/>
+            <w:vAlign w:val="center"/>
+          </w:tcPr>
+          <w:p>
+            <w:pPr>
+              <w:spacing w:after="0" w:line="240" w:lineRule="auto"/>
+            </w:pPr>
+            <w:r/>
+            <w:r>
+              <w:rPr>
+                <w:rFonts w:ascii="Times New Roman" w:hAnsi="Times New Roman" w:eastAsia="Times New Roman"/>
+                <w:b w:val="0"/>
+                <w:sz w:val="22"/>
+              </w:rPr>
+              <w:t>LoginPage, SecureStorage, сессия 24 часа</w:t>
+            </w:r>
+          </w:p>
+        </w:tc>
+        <w:tc>
+          <w:tcPr>
+            <w:tcW w:type="dxa" w:w="3118"/>
+            <w:vAlign w:val="center"/>
+          </w:tcPr>
+          <w:p>
+            <w:pPr>
+              <w:spacing w:after="0" w:line="240" w:lineRule="auto"/>
+            </w:pPr>
+            <w:r/>
+            <w:r>
+              <w:rPr>
+                <w:rFonts w:ascii="Times New Roman" w:hAnsi="Times New Roman" w:eastAsia="Times New Roman"/>
+                <w:b w:val="0"/>
+                <w:sz w:val="22"/>
+              </w:rPr>
+              <w:t>Выполнено</w:t>
+            </w:r>
+          </w:p>
+        </w:tc>
+      </w:tr>
+      <w:tr>
+        <w:tc>
+          <w:tcPr>
+            <w:tcW w:type="dxa" w:w="3118"/>
+            <w:vAlign w:val="center"/>
+          </w:tcPr>
+          <w:p>
+            <w:pPr>
+              <w:spacing w:after="0" w:line="240" w:lineRule="auto"/>
+            </w:pPr>
+            <w:r/>
+            <w:r>
+              <w:rPr>
+                <w:rFonts w:ascii="Times New Roman" w:hAnsi="Times New Roman" w:eastAsia="Times New Roman"/>
+                <w:b w:val="0"/>
+                <w:sz w:val="22"/>
+              </w:rPr>
+              <w:t>Мобильное отображение заявки</w:t>
+            </w:r>
+          </w:p>
+        </w:tc>
+        <w:tc>
+          <w:tcPr>
+            <w:tcW w:type="dxa" w:w="3118"/>
+            <w:vAlign w:val="center"/>
+          </w:tcPr>
+          <w:p>
+            <w:pPr>
+              <w:spacing w:after="0" w:line="240" w:lineRule="auto"/>
+            </w:pPr>
+            <w:r/>
+            <w:r>
+              <w:rPr>
+                <w:rFonts w:ascii="Times New Roman" w:hAnsi="Times New Roman" w:eastAsia="Times New Roman"/>
+                <w:b w:val="0"/>
+                <w:sz w:val="22"/>
+              </w:rPr>
+              <w:t>ID, клиент, товар, серийный номер, статус, причина, дата, внешний комментарий</w:t>
+            </w:r>
+          </w:p>
+        </w:tc>
+        <w:tc>
+          <w:tcPr>
+            <w:tcW w:type="dxa" w:w="3118"/>
+            <w:vAlign w:val="center"/>
+          </w:tcPr>
+          <w:p>
+            <w:pPr>
+              <w:spacing w:after="0" w:line="240" w:lineRule="auto"/>
+            </w:pPr>
+            <w:r/>
+            <w:r>
+              <w:rPr>
+                <w:rFonts w:ascii="Times New Roman" w:hAnsi="Times New Roman" w:eastAsia="Times New Roman"/>
+                <w:b w:val="0"/>
+                <w:sz w:val="22"/>
+              </w:rPr>
+              <w:t>Выполнено</w:t>
+            </w:r>
+          </w:p>
+        </w:tc>
+      </w:tr>
+      <w:tr>
+        <w:tc>
+          <w:tcPr>
+            <w:tcW w:type="dxa" w:w="3118"/>
+            <w:vAlign w:val="center"/>
+          </w:tcPr>
+          <w:p>
+            <w:pPr>
+              <w:spacing w:after="0" w:line="240" w:lineRule="auto"/>
+            </w:pPr>
+            <w:r/>
+            <w:r>
+              <w:rPr>
+                <w:rFonts w:ascii="Times New Roman" w:hAnsi="Times New Roman" w:eastAsia="Times New Roman"/>
+                <w:b w:val="0"/>
+                <w:sz w:val="22"/>
+              </w:rPr>
+              <w:t>Офлайн-работа</w:t>
+            </w:r>
+          </w:p>
+        </w:tc>
+        <w:tc>
+          <w:tcPr>
+            <w:tcW w:type="dxa" w:w="3118"/>
+            <w:vAlign w:val="center"/>
+          </w:tcPr>
+          <w:p>
+            <w:pPr>
+              <w:spacing w:after="0" w:line="240" w:lineRule="auto"/>
+            </w:pPr>
+            <w:r/>
+            <w:r>
+              <w:rPr>
+                <w:rFonts w:ascii="Times New Roman" w:hAnsi="Times New Roman" w:eastAsia="Times New Roman"/>
+                <w:b w:val="0"/>
+                <w:sz w:val="22"/>
+              </w:rPr>
+              <w:t>MAUI хранит заявки локально в JSON; изменения сохраняются без сети</w:t>
+            </w:r>
+          </w:p>
+        </w:tc>
+        <w:tc>
+          <w:tcPr>
+            <w:tcW w:type="dxa" w:w="3118"/>
+            <w:vAlign w:val="center"/>
+          </w:tcPr>
+          <w:p>
+            <w:pPr>
+              <w:spacing w:after="0" w:line="240" w:lineRule="auto"/>
+            </w:pPr>
+            <w:r/>
+            <w:r>
+              <w:rPr>
+                <w:rFonts w:ascii="Times New Roman" w:hAnsi="Times New Roman" w:eastAsia="Times New Roman"/>
+                <w:b w:val="0"/>
+                <w:sz w:val="22"/>
+              </w:rPr>
+              <w:t>Выполнено</w:t>
+            </w:r>
+          </w:p>
+        </w:tc>
+      </w:tr>
+      <w:tr>
+        <w:tc>
+          <w:tcPr>
+            <w:tcW w:type="dxa" w:w="3118"/>
+            <w:vAlign w:val="center"/>
+          </w:tcPr>
+          <w:p>
+            <w:pPr>
+              <w:spacing w:after="0" w:line="240" w:lineRule="auto"/>
+            </w:pPr>
+            <w:r/>
+            <w:r>
+              <w:rPr>
+                <w:rFonts w:ascii="Times New Roman" w:hAnsi="Times New Roman" w:eastAsia="Times New Roman"/>
+                <w:b w:val="0"/>
+                <w:sz w:val="22"/>
+              </w:rPr>
+              <w:t>Фильтр и поиск инженера</w:t>
+            </w:r>
+          </w:p>
+        </w:tc>
+        <w:tc>
+          <w:tcPr>
+            <w:tcW w:type="dxa" w:w="3118"/>
+            <w:vAlign w:val="center"/>
+          </w:tcPr>
+          <w:p>
+            <w:pPr>
+              <w:spacing w:after="0" w:line="240" w:lineRule="auto"/>
+            </w:pPr>
+            <w:r/>
+            <w:r>
+              <w:rPr>
+                <w:rFonts w:ascii="Times New Roman" w:hAnsi="Times New Roman" w:eastAsia="Times New Roman"/>
+                <w:b w:val="0"/>
+                <w:sz w:val="22"/>
+              </w:rPr>
+              <w:t>Фильтр по статусу/причине, поиск по товару/серийному номеру</w:t>
+            </w:r>
+          </w:p>
+        </w:tc>
+        <w:tc>
+          <w:tcPr>
+            <w:tcW w:type="dxa" w:w="3118"/>
+            <w:vAlign w:val="center"/>
+          </w:tcPr>
+          <w:p>
+            <w:pPr>
+              <w:spacing w:after="0" w:line="240" w:lineRule="auto"/>
+            </w:pPr>
+            <w:r/>
+            <w:r>
+              <w:rPr>
+                <w:rFonts w:ascii="Times New Roman" w:hAnsi="Times New Roman" w:eastAsia="Times New Roman"/>
+                <w:b w:val="0"/>
+                <w:sz w:val="22"/>
+              </w:rPr>
+              <w:t>Выполнено</w:t>
+            </w:r>
+          </w:p>
+        </w:tc>
+      </w:tr>
+      <w:tr>
+        <w:tc>
+          <w:tcPr>
+            <w:tcW w:type="dxa" w:w="3118"/>
+            <w:vAlign w:val="center"/>
+          </w:tcPr>
+          <w:p>
+            <w:pPr>
+              <w:spacing w:after="0" w:line="240" w:lineRule="auto"/>
+            </w:pPr>
+            <w:r/>
+            <w:r>
+              <w:rPr>
+                <w:rFonts w:ascii="Times New Roman" w:hAnsi="Times New Roman" w:eastAsia="Times New Roman"/>
+                <w:b w:val="0"/>
+                <w:sz w:val="22"/>
+              </w:rPr>
+              <w:t>Статус и техническое заключение</w:t>
+            </w:r>
+          </w:p>
+        </w:tc>
+        <w:tc>
+          <w:tcPr>
+            <w:tcW w:type="dxa" w:w="3118"/>
+            <w:vAlign w:val="center"/>
+          </w:tcPr>
+          <w:p>
+            <w:pPr>
+              <w:spacing w:after="0" w:line="240" w:lineRule="auto"/>
+            </w:pPr>
+            <w:r/>
+            <w:r>
+              <w:rPr>
+                <w:rFonts w:ascii="Times New Roman" w:hAnsi="Times New Roman" w:eastAsia="Times New Roman"/>
+                <w:b w:val="0"/>
+                <w:sz w:val="22"/>
+              </w:rPr>
+              <w:t>Инженер меняет статус и вводит заключение до 300 символов</w:t>
+            </w:r>
+          </w:p>
+        </w:tc>
+        <w:tc>
+          <w:tcPr>
+            <w:tcW w:type="dxa" w:w="3118"/>
+            <w:vAlign w:val="center"/>
+          </w:tcPr>
+          <w:p>
+            <w:pPr>
+              <w:spacing w:after="0" w:line="240" w:lineRule="auto"/>
+            </w:pPr>
+            <w:r/>
+            <w:r>
+              <w:rPr>
+                <w:rFonts w:ascii="Times New Roman" w:hAnsi="Times New Roman" w:eastAsia="Times New Roman"/>
+                <w:b w:val="0"/>
+                <w:sz w:val="22"/>
+              </w:rPr>
+              <w:t>Выполнено</w:t>
+            </w:r>
+          </w:p>
+        </w:tc>
+      </w:tr>
+      <w:tr>
+        <w:tc>
+          <w:tcPr>
+            <w:tcW w:type="dxa" w:w="3118"/>
+            <w:vAlign w:val="center"/>
+          </w:tcPr>
+          <w:p>
+            <w:pPr>
+              <w:spacing w:after="0" w:line="240" w:lineRule="auto"/>
+            </w:pPr>
+            <w:r/>
+            <w:r>
+              <w:rPr>
+                <w:rFonts w:ascii="Times New Roman" w:hAnsi="Times New Roman" w:eastAsia="Times New Roman"/>
+                <w:b w:val="0"/>
+                <w:sz w:val="22"/>
+              </w:rPr>
+              <w:t>Уведомление о новых заявках</w:t>
+            </w:r>
+          </w:p>
+        </w:tc>
+        <w:tc>
+          <w:tcPr>
+            <w:tcW w:type="dxa" w:w="3118"/>
+            <w:vAlign w:val="center"/>
+          </w:tcPr>
+          <w:p>
+            <w:pPr>
+              <w:spacing w:after="0" w:line="240" w:lineRule="auto"/>
+            </w:pPr>
+            <w:r/>
+            <w:r>
+              <w:rPr>
+                <w:rFonts w:ascii="Times New Roman" w:hAnsi="Times New Roman" w:eastAsia="Times New Roman"/>
+                <w:b w:val="0"/>
+                <w:sz w:val="22"/>
+              </w:rPr>
+              <w:t>При загрузке показывается уведомление о заявках со статусом «Принято»</w:t>
+            </w:r>
+          </w:p>
+        </w:tc>
+        <w:tc>
+          <w:tcPr>
+            <w:tcW w:type="dxa" w:w="3118"/>
+            <w:vAlign w:val="center"/>
+          </w:tcPr>
+          <w:p>
+            <w:pPr>
+              <w:spacing w:after="0" w:line="240" w:lineRule="auto"/>
+            </w:pPr>
+            <w:r/>
+            <w:r>
+              <w:rPr>
+                <w:rFonts w:ascii="Times New Roman" w:hAnsi="Times New Roman" w:eastAsia="Times New Roman"/>
+                <w:b w:val="0"/>
+                <w:sz w:val="22"/>
+              </w:rPr>
+              <w:t>Выполнено</w:t>
+            </w:r>
+          </w:p>
+        </w:tc>
+      </w:tr>
+      <w:tr>
+        <w:tc>
+          <w:tcPr>
+            <w:tcW w:type="dxa" w:w="3118"/>
+            <w:vAlign w:val="center"/>
+          </w:tcPr>
+          <w:p>
+            <w:pPr>
+              <w:spacing w:after="0" w:line="240" w:lineRule="auto"/>
+            </w:pPr>
+            <w:r/>
+            <w:r>
+              <w:rPr>
+                <w:rFonts w:ascii="Times New Roman" w:hAnsi="Times New Roman" w:eastAsia="Times New Roman"/>
+                <w:b w:val="0"/>
+                <w:sz w:val="22"/>
+              </w:rPr>
+              <w:t>Флаг поставщика</w:t>
+            </w:r>
+          </w:p>
+        </w:tc>
+        <w:tc>
+          <w:tcPr>
+            <w:tcW w:type="dxa" w:w="3118"/>
+            <w:vAlign w:val="center"/>
+          </w:tcPr>
+          <w:p>
+            <w:pPr>
+              <w:spacing w:after="0" w:line="240" w:lineRule="auto"/>
+            </w:pPr>
+            <w:r/>
+            <w:r>
+              <w:rPr>
+                <w:rFonts w:ascii="Times New Roman" w:hAnsi="Times New Roman" w:eastAsia="Times New Roman"/>
+                <w:b w:val="0"/>
+                <w:sz w:val="22"/>
+              </w:rPr>
+              <w:t>Флаг есть в десктопе и не выводится в мобильном интерфейсе</w:t>
+            </w:r>
+          </w:p>
+        </w:tc>
+        <w:tc>
+          <w:tcPr>
+            <w:tcW w:type="dxa" w:w="3118"/>
+            <w:vAlign w:val="center"/>
+          </w:tcPr>
+          <w:p>
+            <w:pPr>
+              <w:spacing w:after="0" w:line="240" w:lineRule="auto"/>
+            </w:pPr>
+            <w:r/>
+            <w:r>
+              <w:rPr>
+                <w:rFonts w:ascii="Times New Roman" w:hAnsi="Times New Roman" w:eastAsia="Times New Roman"/>
+                <w:b w:val="0"/>
+                <w:sz w:val="22"/>
+              </w:rPr>
+              <w:t>Выполнено</w:t>
+            </w:r>
+          </w:p>
+        </w:tc>
+      </w:tr>
+      <w:tr>
+        <w:tc>
+          <w:tcPr>
+            <w:tcW w:type="dxa" w:w="3118"/>
+            <w:vAlign w:val="center"/>
+          </w:tcPr>
+          <w:p>
+            <w:pPr>
+              <w:spacing w:after="0" w:line="240" w:lineRule="auto"/>
+            </w:pPr>
+            <w:r/>
+            <w:r>
+              <w:rPr>
+                <w:rFonts w:ascii="Times New Roman" w:hAnsi="Times New Roman" w:eastAsia="Times New Roman"/>
+                <w:b w:val="0"/>
+                <w:sz w:val="22"/>
+              </w:rPr>
+              <w:t>Статистика инженера</w:t>
+            </w:r>
+          </w:p>
+        </w:tc>
+        <w:tc>
+          <w:tcPr>
+            <w:tcW w:type="dxa" w:w="3118"/>
+            <w:vAlign w:val="center"/>
+          </w:tcPr>
+          <w:p>
+            <w:pPr>
+              <w:spacing w:after="0" w:line="240" w:lineRule="auto"/>
+            </w:pPr>
+            <w:r/>
+            <w:r>
+              <w:rPr>
+                <w:rFonts w:ascii="Times New Roman" w:hAnsi="Times New Roman" w:eastAsia="Times New Roman"/>
+                <w:b w:val="0"/>
+                <w:sz w:val="22"/>
+              </w:rPr>
+              <w:t>Статистика за день/неделю: диагностика, ремонт/закрытие, отказы</w:t>
+            </w:r>
+          </w:p>
+        </w:tc>
+        <w:tc>
+          <w:tcPr>
+            <w:tcW w:type="dxa" w:w="3118"/>
+            <w:vAlign w:val="center"/>
+          </w:tcPr>
+          <w:p>
+            <w:pPr>
+              <w:spacing w:after="0" w:line="240" w:lineRule="auto"/>
+            </w:pPr>
+            <w:r/>
+            <w:r>
+              <w:rPr>
+                <w:rFonts w:ascii="Times New Roman" w:hAnsi="Times New Roman" w:eastAsia="Times New Roman"/>
+                <w:b w:val="0"/>
+                <w:sz w:val="22"/>
+              </w:rPr>
+              <w:t>Выполнено</w:t>
+            </w:r>
+          </w:p>
+        </w:tc>
+      </w:tr>
+      <w:tr>
+        <w:tc>
+          <w:tcPr>
+            <w:tcW w:type="dxa" w:w="3118"/>
+            <w:vAlign w:val="center"/>
+          </w:tcPr>
+          <w:p>
+            <w:pPr>
+              <w:spacing w:after="0" w:line="240" w:lineRule="auto"/>
+            </w:pPr>
+            <w:r/>
+            <w:r>
+              <w:rPr>
+                <w:rFonts w:ascii="Times New Roman" w:hAnsi="Times New Roman" w:eastAsia="Times New Roman"/>
+                <w:b w:val="0"/>
+                <w:sz w:val="22"/>
+              </w:rPr>
+              <w:t>Экспорт за период</w:t>
+            </w:r>
+          </w:p>
+        </w:tc>
+        <w:tc>
+          <w:tcPr>
+            <w:tcW w:type="dxa" w:w="3118"/>
+            <w:vAlign w:val="center"/>
+          </w:tcPr>
+          <w:p>
+            <w:pPr>
+              <w:spacing w:after="0" w:line="240" w:lineRule="auto"/>
+            </w:pPr>
+            <w:r/>
+            <w:r>
+              <w:rPr>
+                <w:rFonts w:ascii="Times New Roman" w:hAnsi="Times New Roman" w:eastAsia="Times New Roman"/>
+                <w:b w:val="0"/>
+                <w:sz w:val="22"/>
+              </w:rPr>
+              <w:t>Фильтры периода в десктопе применяются к экспорту и аналитике</w:t>
+            </w:r>
+          </w:p>
+        </w:tc>
+        <w:tc>
+          <w:tcPr>
+            <w:tcW w:type="dxa" w:w="3118"/>
+            <w:vAlign w:val="center"/>
+          </w:tcPr>
+          <w:p>
+            <w:pPr>
+              <w:spacing w:after="0" w:line="240" w:lineRule="auto"/>
+            </w:pPr>
+            <w:r/>
+            <w:r>
+              <w:rPr>
+                <w:rFonts w:ascii="Times New Roman" w:hAnsi="Times New Roman" w:eastAsia="Times New Roman"/>
+                <w:b w:val="0"/>
+                <w:sz w:val="22"/>
+              </w:rPr>
+              <w:t>Выполнено</w:t>
+            </w:r>
+          </w:p>
+        </w:tc>
+      </w:tr>
+    </w:tbl>
     <w:sectPr>
       <w:headerReference w:type="default" r:id="rId10"/>
       <w:pgSz w:w="11906" w:h="16838"/>

</xml_diff>

<commit_message>
Align report structure with sample
Co-authored-by: nikita4lost <nikita4lost@users.noreply.github.com>
</commit_message>
<xml_diff>
--- a/otchet_mikhailov_nikita.docx
+++ b/otchet_mikhailov_nikita.docx
@@ -25927,7 +25927,7 @@
           <w:b/>
           <w:sz w:val="28"/>
         </w:rPr>
-        <w:t>4.1.3 Установка пакетов и библиотек</w:t>
+        <w:t>4.1.3 Установка NuGet пакетов для мобильного приложения</w:t>
       </w:r>
     </w:p>
     <w:p>
@@ -26013,7 +26013,7 @@
           <w:b w:val="0"/>
           <w:sz w:val="28"/>
         </w:rPr>
-        <w:t>Таблица 17 Список установленных пакетов и компонентов .NET</w:t>
+        <w:t>Таблица 17 Список установленных пакетов NuGet</w:t>
       </w:r>
     </w:p>
     <w:tbl>
@@ -26485,6 +26485,29 @@
       </w:tr>
     </w:tbl>
     <w:p>
+      <w:r>
+        <w:rPr>
+          <w:rFonts w:ascii="Times New Roman" w:hAnsi="Times New Roman" w:eastAsia="Times New Roman"/>
+          <w:b/>
+          <w:sz w:val="28"/>
+        </w:rPr>
+        <w:t>4.1.4 Установка NuGet пакетов для десктопного приложения</w:t>
+      </w:r>
+    </w:p>
+    <w:p>
+      <w:pPr>
+        <w:jc w:val="both"/>
+      </w:pPr>
+      <w:r>
+        <w:rPr>
+          <w:rFonts w:ascii="Times New Roman" w:hAnsi="Times New Roman" w:eastAsia="Times New Roman"/>
+          <w:b w:val="0"/>
+          <w:sz w:val="28"/>
+        </w:rPr>
+        <w:t>Для десктопного WPF-приложения в Visual Studio используется диспетчер пакетов NuGet. В проект добавлены или предусмотрены пакеты для локального хранения, экспорта Word/Excel, построения аналитики и работы с JSON. После последних исправлений код также приведён к синтаксису, совместимому с используемой версией Visual Studio.</w:t>
+      </w:r>
+    </w:p>
+    <w:p>
       <w:pPr>
         <w:spacing w:line="360" w:lineRule="auto" w:before="160" w:after="80"/>
         <w:jc w:val="left"/>
@@ -26495,7 +26518,19 @@
           <w:b/>
           <w:sz w:val="28"/>
         </w:rPr>
-        <w:t>4.1.4 Настройка системы контроля версий Git</w:t>
+        <w:t>4.1.5 Настройка системы контроля версий Git</w:t>
+      </w:r>
+    </w:p>
+    <w:p>
+      <w:pPr>
+        <w:jc w:val="left"/>
+      </w:pPr>
+      <w:r>
+        <w:rPr>
+          <w:rFonts w:ascii="Times New Roman" w:hAnsi="Times New Roman" w:eastAsia="Times New Roman"/>
+          <w:b w:val="0"/>
+          <w:sz w:val="28"/>
+        </w:rPr>
       </w:r>
     </w:p>
     <w:p>
@@ -31949,6 +31984,19 @@
         <w:t>Таблица 26 Содержимое репозитория</w:t>
       </w:r>
     </w:p>
+    <w:p>
+      <w:pPr>
+        <w:jc w:val="left"/>
+      </w:pPr>
+      <w:r>
+        <w:rPr>
+          <w:rFonts w:ascii="Times New Roman" w:hAnsi="Times New Roman" w:eastAsia="Times New Roman"/>
+          <w:b w:val="0"/>
+          <w:sz w:val="28"/>
+        </w:rPr>
+        <w:t>После сверки с вариантом 8 в программу были внесены дополнительные изменения: добавлена авторизация инженера, фильтрация по причине, поиск по товару и серийному номеру, отдельные внутренний и внешний комментарии, аналитика по причинам и суммам, AndroidManifest и Android-платформенные файлы MAUI, а также исправлен цвет текста в карточке мобильного приложения для читаемости описания товара на возврат.</w:t>
+      </w:r>
+    </w:p>
     <w:tbl>
       <w:tblPr>
         <w:tblW w:type="auto" w:w="0"/>
@@ -41515,6 +41563,16 @@
       </w:r>
     </w:p>
     <w:p>
+      <w:r>
+        <w:rPr>
+          <w:rFonts w:ascii="Times New Roman" w:hAnsi="Times New Roman" w:eastAsia="Times New Roman"/>
+          <w:b/>
+          <w:sz w:val="28"/>
+        </w:rPr>
+        <w:t>Процесс обработки инцидентов</w:t>
+      </w:r>
+    </w:p>
+    <w:p>
       <w:pPr>
         <w:spacing w:line="360" w:lineRule="auto" w:after="0" w:before="0"/>
         <w:jc w:val="center"/>
@@ -41803,6 +41861,16 @@
       </w:tr>
     </w:tbl>
     <w:p>
+      <w:r>
+        <w:rPr>
+          <w:rFonts w:ascii="Times New Roman" w:hAnsi="Times New Roman" w:eastAsia="Times New Roman"/>
+          <w:b/>
+          <w:sz w:val="28"/>
+        </w:rPr>
+        <w:t>6.3.4 План будущих обновлений</w:t>
+      </w:r>
+    </w:p>
+    <w:p>
       <w:pPr>
         <w:spacing w:line="360" w:lineRule="auto" w:after="0" w:before="0"/>
         <w:jc w:val="center"/>
@@ -42186,7 +42254,7 @@
           <w:b/>
           <w:sz w:val="28"/>
         </w:rPr>
-        <w:t>Руководство пользователя</w:t>
+        <w:t>7.1.1 Руководство пользователя</w:t>
       </w:r>
     </w:p>
     <w:p>
@@ -42755,7 +42823,7 @@
           <w:b w:val="0"/>
           <w:sz w:val="28"/>
         </w:rPr>
-        <w:t>Таблица 53 Условия выполнения программы (мобильное)</w:t>
+        <w:t>Таблица 51 Условия выполнения программы (мобильное)</w:t>
       </w:r>
     </w:p>
     <w:tbl>
@@ -43111,7 +43179,7 @@
           <w:b w:val="0"/>
           <w:sz w:val="28"/>
         </w:rPr>
-        <w:t>Таблица 54 Учётные данные</w:t>
+        <w:t>Таблица 52 Учётные данные</w:t>
       </w:r>
     </w:p>
     <w:tbl>
@@ -43773,7 +43841,7 @@
           <w:b/>
           <w:sz w:val="28"/>
         </w:rPr>
-        <w:t>Техническое описание программы</w:t>
+        <w:t>7.1.2 Руководство программиста</w:t>
       </w:r>
     </w:p>
     <w:p>
@@ -47582,7 +47650,7 @@
           <w:b w:val="0"/>
           <w:sz w:val="28"/>
         </w:rPr>
-        <w:t>Разработанный прототип позволяет регистрировать обращения клиентов, проверять корректность данных, хранить заявки, выполнять синхронизацию, формировать отчёты Word и Excel, а также обновлять статус заявки и техническое заключение со стороны инженера.</w:t>
+        <w:t>Разработанный прототип позволяет регистрировать обращения клиентов, проверять корректность данных, хранить заявки, выполнять синхронизацию, формировать отчёты Word и Excel, а также обновлять статус заявки и техническое заключение со стороны инженера. После дополнительной сверки с вариантом 8 в программу добавлены фильтры по причине и периоду, авторизация engineer, SecureStorage-сессия, статистика инженера, Android-платформенные файлы MAUI и исправление читаемости мобильной карточки товара.</w:t>
       </w:r>
     </w:p>
     <w:p>
@@ -48921,6 +48989,22 @@
         </w:tc>
       </w:tr>
     </w:tbl>
+    <w:p/>
+    <w:p>
+      <w:pPr>
+        <w:spacing w:line="360" w:lineRule="auto"/>
+        <w:ind w:firstLine="709"/>
+        <w:jc w:val="both"/>
+      </w:pPr>
+      <w:r>
+        <w:rPr>
+          <w:rFonts w:ascii="Times New Roman" w:hAnsi="Times New Roman" w:eastAsia="Times New Roman"/>
+          <w:b w:val="0"/>
+          <w:sz w:val="28"/>
+        </w:rPr>
+        <w:t>Дополнительно после проверки на телефоне исправлена читаемость карточки мобильного приложения: описание товара, серийный номер, статус, дата и причина возврата выводятся тёмным цветом на светлой карточке.</w:t>
+      </w:r>
+    </w:p>
     <w:sectPr>
       <w:headerReference w:type="default" r:id="rId10"/>
       <w:pgSz w:w="11906" w:h="16838"/>

</xml_diff>